<commit_message>
vault backup: 2026-09-13 13:14:25
</commit_message>
<xml_diff>
--- a/00.需求/通知复尺自动化/专利-一种基于图像识别结果的工地任务通知方法-20260913/技术交底书-一种基于图像识别结果的工地任务通知方法-20260913.docx
+++ b/00.需求/通知复尺自动化/专利-一种基于图像识别结果的工地任务通知方法-20260913/技术交底书-一种基于图像识别结果的工地任务通知方法-20260913.docx
@@ -1,6 +1,6 @@
 
 <file path=word/document.xml><?xml version="1.0" encoding="utf-8"?>
-<w:document xmlns:r="http://schemas.openxmlformats.org/officeDocument/2006/relationships" xmlns:w="http://schemas.openxmlformats.org/wordprocessingml/2006/main">
+<w:document xmlns:wpc="http://schemas.microsoft.com/office/word/2010/wordprocessingCanvas" xmlns:cx="http://schemas.microsoft.com/office/drawing/2014/chartex" xmlns:mc="http://schemas.openxmlformats.org/markup-compatibility/2006" xmlns:o="urn:schemas-microsoft-com:office:office" xmlns:r="http://schemas.openxmlformats.org/officeDocument/2006/relationships" xmlns:m="http://schemas.openxmlformats.org/officeDocument/2006/math" xmlns:v="urn:schemas-microsoft-com:vml" xmlns:wp14="http://schemas.microsoft.com/office/word/2010/wordprocessingDrawing" xmlns:wp="http://schemas.openxmlformats.org/drawingml/2006/wordprocessingDrawing" xmlns:w10="urn:schemas-microsoft-com:office:word" xmlns:w="http://schemas.openxmlformats.org/wordprocessingml/2006/main" xmlns:w14="http://schemas.microsoft.com/office/word/2010/wordml" xmlns:w15="http://schemas.microsoft.com/office/word/2012/wordml" xmlns:w16se="http://schemas.microsoft.com/office/word/2015/wordml/symex" xmlns:wpg="http://schemas.microsoft.com/office/word/2010/wordprocessingGroup" xmlns:wpi="http://schemas.microsoft.com/office/word/2010/wordprocessingInk" xmlns:wne="http://schemas.microsoft.com/office/word/2006/wordml" xmlns:wps="http://schemas.microsoft.com/office/word/2010/wordprocessingShape" xmlns:a="http://schemas.openxmlformats.org/drawingml/2006/main" xmlns:pic="http://schemas.openxmlformats.org/drawingml/2006/picture" mc:Ignorable="w14 w15 w16se wp14">
   <w:body>
     <w:tbl>
       <w:tblPr>
@@ -1869,145 +1869,347 @@
                 <w:color w:val="000000" w:themeColor="text1"/>
                 <w:szCs w:val="21"/>
               </w:rPr>
-              <w:t>请用简洁的语言说明该发明所属的技术领域或者直接应用的技术领域；详细介绍一下与本发明专利申请要求保护的主题相关的现有技术的现状、工作原理、工作方式如何？客观地指出现有技术的缺点和不足，解释一下原因。</w:t>
-            </w:r>
-          </w:p>
-          <w:p>
-            <w:pPr>
-              <w:rPr>
-                <w:rFonts w:hint="eastAsia" w:ascii="仿宋" w:hAnsi="仿宋" w:eastAsia="仿宋"/>
-                <w:color w:val="000000" w:themeColor="text1"/>
-                <w:szCs w:val="21"/>
-              </w:rPr>
-            </w:pPr>
-            <w:r>
-              <w:rPr>
-                <w:rFonts w:hint="eastAsia" w:ascii="仿宋" w:hAnsi="仿宋" w:eastAsia="仿宋"/>
-                <w:color w:val="000000" w:themeColor="text1"/>
-                <w:szCs w:val="21"/>
-              </w:rPr>
-              <w:t>【填写内容】</w:t>
-            </w:r>
-          </w:p>
-          <w:p>
-            <w:pPr>
-              <w:rPr>
-                <w:rFonts w:hint="eastAsia" w:ascii="仿宋" w:hAnsi="仿宋" w:eastAsia="仿宋"/>
-                <w:color w:val="000000" w:themeColor="text1"/>
-                <w:szCs w:val="21"/>
-              </w:rPr>
-            </w:pPr>
-            <w:r>
-              <w:rPr>
-                <w:rFonts w:hint="eastAsia" w:ascii="仿宋" w:hAnsi="仿宋" w:eastAsia="仿宋"/>
-                <w:color w:val="000000" w:themeColor="text1"/>
-                <w:szCs w:val="21"/>
-              </w:rPr>
-              <w:t>一、技术领域：本发明涉及装修履约任务处理与计算机应用技术领域，具体涉及一种基于图像识别结果的工地任务通知方法及系统。</w:t>
-            </w:r>
-          </w:p>
-          <w:p>
-            <w:pPr>
-              <w:rPr>
-                <w:rFonts w:hint="eastAsia" w:ascii="仿宋" w:hAnsi="仿宋" w:eastAsia="仿宋"/>
-                <w:color w:val="000000" w:themeColor="text1"/>
-                <w:szCs w:val="21"/>
-              </w:rPr>
-            </w:pPr>
-            <w:r>
-              <w:rPr>
-                <w:rFonts w:hint="eastAsia" w:ascii="仿宋" w:hAnsi="仿宋" w:eastAsia="仿宋"/>
-                <w:color w:val="000000" w:themeColor="text1"/>
-                <w:szCs w:val="21"/>
-              </w:rPr>
-              <w:t>二、现有技术现状、工作原理与工作方式：在装修交付流程中，主材（如木门、橱柜、集成吊顶等）的履约由一系列有序任务节点构成，其中存在大量"通知类任务"（如通知复尺任务）——当工地现场前置工序（墙面、交界面处理等）达到可上门服务条件时，需由工地负责人（工长/项目经理）通知供应商或设计师上门。现有技术的工作方式为：人工到现场检查交界面状态，人工判断是否满足通知条件，再逐条在任务系统中手动填写期望上门时间、上传现场照片并提交通知任务。</w:t>
-            </w:r>
-          </w:p>
-          <w:p>
-            <w:pPr>
-              <w:rPr>
-                <w:rFonts w:hint="eastAsia" w:ascii="仿宋" w:hAnsi="仿宋" w:eastAsia="仿宋"/>
-                <w:color w:val="000000" w:themeColor="text1"/>
-                <w:szCs w:val="21"/>
-              </w:rPr>
-            </w:pPr>
-            <w:r>
-              <w:rPr>
-                <w:rFonts w:hint="eastAsia" w:ascii="仿宋" w:hAnsi="仿宋" w:eastAsia="仿宋"/>
-                <w:color w:val="000000" w:themeColor="text1"/>
-                <w:szCs w:val="21"/>
-              </w:rPr>
-              <w:t>三、现有技术的缺点和不足及原因：</w:t>
-            </w:r>
-          </w:p>
-          <w:p>
-            <w:pPr>
-              <w:rPr>
-                <w:rFonts w:hint="eastAsia" w:ascii="仿宋" w:hAnsi="仿宋" w:eastAsia="仿宋"/>
-                <w:color w:val="000000" w:themeColor="text1"/>
-                <w:szCs w:val="21"/>
-              </w:rPr>
-            </w:pPr>
-            <w:r>
-              <w:rPr>
-                <w:rFonts w:hint="eastAsia" w:ascii="仿宋" w:hAnsi="仿宋" w:eastAsia="仿宋"/>
-                <w:color w:val="000000" w:themeColor="text1"/>
-                <w:szCs w:val="21"/>
-              </w:rPr>
-              <w:t>1. 判断环节人工化、标准不统一：是否满足通知条件完全依赖现场人员个人经验判断，不同人员对同一现场的判定结果可能不同，判断依据（现场照片）由人工随手拍摄，质量与时序无保证，且无法留证复核。</w:t>
-            </w:r>
-          </w:p>
-          <w:p>
-            <w:pPr>
-              <w:rPr>
-                <w:rFonts w:hint="eastAsia" w:ascii="仿宋" w:hAnsi="仿宋" w:eastAsia="仿宋"/>
-                <w:color w:val="000000" w:themeColor="text1"/>
-                <w:szCs w:val="21"/>
-              </w:rPr>
-            </w:pPr>
-            <w:r>
-              <w:rPr>
-                <w:rFonts w:hint="eastAsia" w:ascii="仿宋" w:hAnsi="仿宋" w:eastAsia="仿宋"/>
-                <w:color w:val="000000" w:themeColor="text1"/>
-                <w:szCs w:val="21"/>
-              </w:rPr>
-              <w:t>2. 操作环节逐条化、效率低：一个负责人名下往往有多个工地、每个工地多个品类的通知任务，需逐条进入任务页面分别填写与提交，操作成本随任务数量线性增长，任务堆积时易漏办、迟办。</w:t>
-            </w:r>
-          </w:p>
-          <w:p>
-            <w:pPr>
-              <w:rPr>
-                <w:rFonts w:hint="eastAsia" w:ascii="仿宋" w:hAnsi="仿宋" w:eastAsia="仿宋"/>
-                <w:color w:val="000000" w:themeColor="text1"/>
-                <w:szCs w:val="21"/>
-              </w:rPr>
-            </w:pPr>
-            <w:r>
-              <w:rPr>
-                <w:rFonts w:hint="eastAsia" w:ascii="仿宋" w:hAnsi="仿宋" w:eastAsia="仿宋"/>
-                <w:color w:val="000000" w:themeColor="text1"/>
-                <w:szCs w:val="21"/>
-              </w:rPr>
-              <w:t>3. 已有图像识别技术与任务系统割裂：现有工地摄像头图像识别、照片识别技术通常仅用于施工进度留证或安全巡检，识别结果与任务履约状态机之间没有数据通道，识别结论无法直接驱动任务的状态流转、字段填充或自动执行，两套系统各自独立，无法形成闭环。</w:t>
-            </w:r>
-          </w:p>
-          <w:p>
-            <w:pPr>
-              <w:spacing w:line="0" w:lineRule="atLeast"/>
-              <w:ind w:firstLine="420" w:firstLineChars="200"/>
-              <w:rPr>
-                <w:rFonts w:eastAsia="黑体"/>
-                <w:color w:val="FF0000"/>
-                <w:szCs w:val="21"/>
-              </w:rPr>
-            </w:pPr>
-            <w:r>
-              <w:rPr>
-                <w:rFonts w:hint="eastAsia" w:ascii="仿宋" w:hAnsi="仿宋" w:eastAsia="仿宋"/>
-                <w:color w:val="000000" w:themeColor="text1"/>
-                <w:szCs w:val="21"/>
-              </w:rPr>
-              <w:t>4. 缺乏自动化安全机制：若简单地将识别结果直接触发任务执行，会引入误识别风险、自动化范围失控、人工与自动双通道重复执行等新问题；现有技术中没有针对"识别结论消费侧"的分态处置、灰度控制与幂等防重机制。</w:t>
+              <w:t xml:space="preserve">请用简洁的语言说明该发明所属的技术领域或者直接应用的技术领域；详细介绍一下与本发明专利申请要求保护的主题相关的现有技术的现状、工作原理、工作方式如何？客观地指出现有技术的缺点和不足，解释一下原因。</w:t>
+            </w:r>
+          </w:p>
+          <w:p>
+            <w:pPr>
+              <w:rPr>
+                <w:rFonts w:hint="eastAsia" w:ascii="仿宋" w:hAnsi="仿宋" w:eastAsia="仿宋"/>
+                <w:color w:val="000000" w:themeColor="text1"/>
+                <w:szCs w:val="21"/>
+              </w:rPr>
+            </w:pPr>
+            <w:r>
+              <w:rPr>
+                <w:rFonts w:hint="eastAsia" w:ascii="仿宋" w:hAnsi="仿宋" w:eastAsia="仿宋"/>
+                <w:color w:val="000000" w:themeColor="text1"/>
+                <w:szCs w:val="21"/>
+              </w:rPr>
+              <w:t xml:space="preserve"/>
+            </w:r>
+          </w:p>
+          <w:p>
+            <w:pPr>
+              <w:rPr>
+                <w:rFonts w:hint="eastAsia" w:ascii="仿宋" w:hAnsi="仿宋" w:eastAsia="仿宋"/>
+                <w:color w:val="000000" w:themeColor="text1"/>
+                <w:szCs w:val="21"/>
+              </w:rPr>
+            </w:pPr>
+            <w:r>
+              <w:rPr>
+                <w:rFonts w:hint="eastAsia" w:ascii="仿宋" w:hAnsi="仿宋" w:eastAsia="仿宋"/>
+                <w:color w:val="000000" w:themeColor="text1"/>
+                <w:szCs w:val="21"/>
+              </w:rPr>
+              <w:t xml:space="preserve">【填写内容】</w:t>
+            </w:r>
+          </w:p>
+          <w:p>
+            <w:pPr>
+              <w:rPr>
+                <w:rFonts w:hint="eastAsia" w:ascii="仿宋" w:hAnsi="仿宋" w:eastAsia="仿宋"/>
+                <w:color w:val="000000" w:themeColor="text1"/>
+                <w:szCs w:val="21"/>
+              </w:rPr>
+            </w:pPr>
+            <w:r>
+              <w:rPr>
+                <w:rFonts w:hint="eastAsia" w:ascii="仿宋" w:hAnsi="仿宋" w:eastAsia="仿宋"/>
+                <w:color w:val="000000" w:themeColor="text1"/>
+                <w:szCs w:val="21"/>
+              </w:rPr>
+              <w:t xml:space="preserve"/>
+            </w:r>
+          </w:p>
+          <w:p>
+            <w:pPr>
+              <w:rPr>
+                <w:rFonts w:hint="eastAsia" w:ascii="仿宋" w:hAnsi="仿宋" w:eastAsia="仿宋"/>
+                <w:color w:val="000000" w:themeColor="text1"/>
+                <w:szCs w:val="21"/>
+              </w:rPr>
+            </w:pPr>
+            <w:r>
+              <w:rPr>
+                <w:rFonts w:hint="eastAsia" w:ascii="仿宋" w:hAnsi="仿宋" w:eastAsia="仿宋"/>
+                <w:color w:val="000000" w:themeColor="text1"/>
+                <w:szCs w:val="21"/>
+              </w:rPr>
+              <w:t xml:space="preserve">一、技术领域：本发明涉及任务调度与数据处理技术领域，具体涉及一种基于图像识别结果的工地任务通知方法、系统及计算机可读存储介质。</w:t>
+            </w:r>
+          </w:p>
+          <w:p>
+            <w:pPr>
+              <w:rPr>
+                <w:rFonts w:hint="eastAsia" w:ascii="仿宋" w:hAnsi="仿宋" w:eastAsia="仿宋"/>
+                <w:color w:val="000000" w:themeColor="text1"/>
+                <w:szCs w:val="21"/>
+              </w:rPr>
+            </w:pPr>
+            <w:r>
+              <w:rPr>
+                <w:rFonts w:hint="eastAsia" w:ascii="仿宋" w:hAnsi="仿宋" w:eastAsia="仿宋"/>
+                <w:color w:val="000000" w:themeColor="text1"/>
+                <w:szCs w:val="21"/>
+              </w:rPr>
+              <w:t xml:space="preserve"/>
+            </w:r>
+          </w:p>
+          <w:p>
+            <w:pPr>
+              <w:rPr>
+                <w:rFonts w:hint="eastAsia" w:ascii="仿宋" w:hAnsi="仿宋" w:eastAsia="仿宋"/>
+                <w:color w:val="000000" w:themeColor="text1"/>
+                <w:szCs w:val="21"/>
+              </w:rPr>
+            </w:pPr>
+            <w:r>
+              <w:rPr>
+                <w:rFonts w:hint="eastAsia" w:ascii="仿宋" w:hAnsi="仿宋" w:eastAsia="仿宋"/>
+                <w:color w:val="000000" w:themeColor="text1"/>
+                <w:szCs w:val="21"/>
+              </w:rPr>
+              <w:t xml:space="preserve">二、现有技术现状与工作方式：在工程交付场景中，材料履约任务由若干有序的任务节点构成，其中包含通知类任务——例如当工地现场的前置工序达到可上门服务条件时，需向供应商或服务人员发出上门通知。现有技术中，上述过程由现场负责人员人工完成：人工到场查看交界面状态，凭经验判断是否满足通知条件，再在任务处理界面中逐条填写期望上门时间、上传现场照片并提交。</w:t>
+            </w:r>
+          </w:p>
+          <w:p>
+            <w:pPr>
+              <w:rPr>
+                <w:rFonts w:hint="eastAsia" w:ascii="仿宋" w:hAnsi="仿宋" w:eastAsia="仿宋"/>
+                <w:color w:val="000000" w:themeColor="text1"/>
+                <w:szCs w:val="21"/>
+              </w:rPr>
+            </w:pPr>
+            <w:r>
+              <w:rPr>
+                <w:rFonts w:hint="eastAsia" w:ascii="仿宋" w:hAnsi="仿宋" w:eastAsia="仿宋"/>
+                <w:color w:val="000000" w:themeColor="text1"/>
+                <w:szCs w:val="21"/>
+              </w:rPr>
+              <w:t xml:space="preserve"/>
+            </w:r>
+          </w:p>
+          <w:p>
+            <w:pPr>
+              <w:rPr>
+                <w:rFonts w:hint="eastAsia" w:ascii="仿宋" w:hAnsi="仿宋" w:eastAsia="仿宋"/>
+                <w:color w:val="000000" w:themeColor="text1"/>
+                <w:szCs w:val="21"/>
+              </w:rPr>
+            </w:pPr>
+            <w:r>
+              <w:rPr>
+                <w:rFonts w:hint="eastAsia" w:ascii="仿宋" w:hAnsi="仿宋" w:eastAsia="仿宋"/>
+                <w:color w:val="000000" w:themeColor="text1"/>
+                <w:szCs w:val="21"/>
+              </w:rPr>
+              <w:t xml:space="preserve">另一方面，对工地摄像头视频与现场照片进行自动分析（例如判断工序是否完成、现场是否具备下一步作业条件）的图像识别技术已经存在，但其现有用途集中于施工进度留证、安全巡检等场景。</w:t>
+            </w:r>
+          </w:p>
+          <w:p>
+            <w:pPr>
+              <w:rPr>
+                <w:rFonts w:hint="eastAsia" w:ascii="仿宋" w:hAnsi="仿宋" w:eastAsia="仿宋"/>
+                <w:color w:val="000000" w:themeColor="text1"/>
+                <w:szCs w:val="21"/>
+              </w:rPr>
+            </w:pPr>
+            <w:r>
+              <w:rPr>
+                <w:rFonts w:hint="eastAsia" w:ascii="仿宋" w:hAnsi="仿宋" w:eastAsia="仿宋"/>
+                <w:color w:val="000000" w:themeColor="text1"/>
+                <w:szCs w:val="21"/>
+              </w:rPr>
+              <w:t xml:space="preserve"/>
+            </w:r>
+          </w:p>
+          <w:p>
+            <w:pPr>
+              <w:rPr>
+                <w:rFonts w:hint="eastAsia" w:ascii="仿宋" w:hAnsi="仿宋" w:eastAsia="仿宋"/>
+                <w:color w:val="000000" w:themeColor="text1"/>
+                <w:szCs w:val="21"/>
+              </w:rPr>
+            </w:pPr>
+            <w:r>
+              <w:rPr>
+                <w:rFonts w:hint="eastAsia" w:ascii="仿宋" w:hAnsi="仿宋" w:eastAsia="仿宋"/>
+                <w:color w:val="000000" w:themeColor="text1"/>
+                <w:szCs w:val="21"/>
+              </w:rPr>
+              <w:t xml:space="preserve">三、现有技术的缺点和不足及其原因：</w:t>
+            </w:r>
+          </w:p>
+          <w:p>
+            <w:pPr>
+              <w:rPr>
+                <w:rFonts w:hint="eastAsia" w:ascii="仿宋" w:hAnsi="仿宋" w:eastAsia="仿宋"/>
+                <w:color w:val="000000" w:themeColor="text1"/>
+                <w:szCs w:val="21"/>
+              </w:rPr>
+            </w:pPr>
+            <w:r>
+              <w:rPr>
+                <w:rFonts w:hint="eastAsia" w:ascii="仿宋" w:hAnsi="仿宋" w:eastAsia="仿宋"/>
+                <w:color w:val="000000" w:themeColor="text1"/>
+                <w:szCs w:val="21"/>
+              </w:rPr>
+              <w:t xml:space="preserve"/>
+            </w:r>
+          </w:p>
+          <w:p>
+            <w:pPr>
+              <w:rPr>
+                <w:rFonts w:hint="eastAsia" w:ascii="仿宋" w:hAnsi="仿宋" w:eastAsia="仿宋"/>
+                <w:color w:val="000000" w:themeColor="text1"/>
+                <w:szCs w:val="21"/>
+              </w:rPr>
+            </w:pPr>
+            <w:r>
+              <w:rPr>
+                <w:rFonts w:hint="eastAsia" w:ascii="仿宋" w:hAnsi="仿宋" w:eastAsia="仿宋"/>
+                <w:color w:val="000000" w:themeColor="text1"/>
+                <w:szCs w:val="21"/>
+              </w:rPr>
+              <w:t xml:space="preserve">1. 识别结论与任务系统之间缺少数据通路。现有识别系统的输出为面向人的结论性信息，其数据结构与任务系统的节点状态机之间不存在映射关系，识别结论无法驱动任务节点的字段填充、执行资格判定与状态流转；二者只能由人工在系统之间搬运，形成"识别归识别、任务归任务"的割裂状态。</w:t>
+            </w:r>
+          </w:p>
+          <w:p>
+            <w:pPr>
+              <w:rPr>
+                <w:rFonts w:hint="eastAsia" w:ascii="仿宋" w:hAnsi="仿宋" w:eastAsia="仿宋"/>
+                <w:color w:val="000000" w:themeColor="text1"/>
+                <w:szCs w:val="21"/>
+              </w:rPr>
+            </w:pPr>
+            <w:r>
+              <w:rPr>
+                <w:rFonts w:hint="eastAsia" w:ascii="仿宋" w:hAnsi="仿宋" w:eastAsia="仿宋"/>
+                <w:color w:val="000000" w:themeColor="text1"/>
+                <w:szCs w:val="21"/>
+              </w:rPr>
+              <w:t xml:space="preserve"/>
+            </w:r>
+          </w:p>
+          <w:p>
+            <w:pPr>
+              <w:rPr>
+                <w:rFonts w:hint="eastAsia" w:ascii="仿宋" w:hAnsi="仿宋" w:eastAsia="仿宋"/>
+                <w:color w:val="000000" w:themeColor="text1"/>
+                <w:szCs w:val="21"/>
+              </w:rPr>
+            </w:pPr>
+            <w:r>
+              <w:rPr>
+                <w:rFonts w:hint="eastAsia" w:ascii="仿宋" w:hAnsi="仿宋" w:eastAsia="仿宋"/>
+                <w:color w:val="000000" w:themeColor="text1"/>
+                <w:szCs w:val="21"/>
+              </w:rPr>
+              <w:t xml:space="preserve">2. 多执行通道并发操作同一任务时缺少互斥机制。任务的执行可由人工批量提交与定时自动执行两种方式触发；现有实现中二者各自独立判断"是否可执行"，判定与写入之间不具备原子性约束，同一任务节点可能被重复执行，进而导致对下游链路（通知发送、状态流转、节点推进）的重复调用与状态错乱。</w:t>
+            </w:r>
+          </w:p>
+          <w:p>
+            <w:pPr>
+              <w:rPr>
+                <w:rFonts w:hint="eastAsia" w:ascii="仿宋" w:hAnsi="仿宋" w:eastAsia="仿宋"/>
+                <w:color w:val="000000" w:themeColor="text1"/>
+                <w:szCs w:val="21"/>
+              </w:rPr>
+            </w:pPr>
+            <w:r>
+              <w:rPr>
+                <w:rFonts w:hint="eastAsia" w:ascii="仿宋" w:hAnsi="仿宋" w:eastAsia="仿宋"/>
+                <w:color w:val="000000" w:themeColor="text1"/>
+                <w:szCs w:val="21"/>
+              </w:rPr>
+              <w:t xml:space="preserve"/>
+            </w:r>
+          </w:p>
+          <w:p>
+            <w:pPr>
+              <w:rPr>
+                <w:rFonts w:hint="eastAsia" w:ascii="仿宋" w:hAnsi="仿宋" w:eastAsia="仿宋"/>
+                <w:color w:val="000000" w:themeColor="text1"/>
+                <w:szCs w:val="21"/>
+              </w:rPr>
+            </w:pPr>
+            <w:r>
+              <w:rPr>
+                <w:rFonts w:hint="eastAsia" w:ascii="仿宋" w:hAnsi="仿宋" w:eastAsia="仿宋"/>
+                <w:color w:val="000000" w:themeColor="text1"/>
+                <w:szCs w:val="21"/>
+              </w:rPr>
+              <w:t xml:space="preserve">3. 机器生成内容与人工修改内容分散存储，缺少一致性策略。机器推荐内容写入判定记录，人工修改内容写入任务节点，二者分属不同数据源且无明确的读取优先级与回写规则，在页面填充或执行取数时可能发生人工修改结果被机器结果覆盖、或机器结果无法被读取的情况。</w:t>
+            </w:r>
+          </w:p>
+          <w:p>
+            <w:pPr>
+              <w:rPr>
+                <w:rFonts w:hint="eastAsia" w:ascii="仿宋" w:hAnsi="仿宋" w:eastAsia="仿宋"/>
+                <w:color w:val="000000" w:themeColor="text1"/>
+                <w:szCs w:val="21"/>
+              </w:rPr>
+            </w:pPr>
+            <w:r>
+              <w:rPr>
+                <w:rFonts w:hint="eastAsia" w:ascii="仿宋" w:hAnsi="仿宋" w:eastAsia="仿宋"/>
+                <w:color w:val="000000" w:themeColor="text1"/>
+                <w:szCs w:val="21"/>
+              </w:rPr>
+              <w:t xml:space="preserve"/>
+            </w:r>
+          </w:p>
+          <w:p>
+            <w:pPr>
+              <w:rPr>
+                <w:rFonts w:hint="eastAsia" w:ascii="仿宋" w:hAnsi="仿宋" w:eastAsia="仿宋"/>
+                <w:color w:val="000000" w:themeColor="text1"/>
+                <w:szCs w:val="21"/>
+              </w:rPr>
+            </w:pPr>
+            <w:r>
+              <w:rPr>
+                <w:rFonts w:hint="eastAsia" w:ascii="仿宋" w:hAnsi="仿宋" w:eastAsia="仿宋"/>
+                <w:color w:val="000000" w:themeColor="text1"/>
+                <w:szCs w:val="21"/>
+              </w:rPr>
+              <w:t xml:space="preserve">4. 缺少分级放行与执行隔离机制。自动化执行若全量放开，误判将直接造成错误通知；批量执行中单个任务异常亦可能导致整批中断，缺少失败隔离与结果对账能力。</w:t>
+            </w:r>
+          </w:p>
+          <w:p>
+            <w:pPr>
+              <w:rPr>
+                <w:rFonts w:hint="eastAsia" w:ascii="仿宋" w:hAnsi="仿宋" w:eastAsia="仿宋"/>
+                <w:color w:val="000000" w:themeColor="text1"/>
+                <w:szCs w:val="21"/>
+              </w:rPr>
+            </w:pPr>
+            <w:r>
+              <w:rPr>
+                <w:rFonts w:hint="eastAsia" w:ascii="仿宋" w:hAnsi="仿宋" w:eastAsia="仿宋"/>
+                <w:color w:val="000000" w:themeColor="text1"/>
+                <w:szCs w:val="21"/>
+              </w:rPr>
+              <w:t xml:space="preserve"/>
+            </w:r>
+          </w:p>
+          <w:p>
+            <w:pPr>
+              <w:rPr>
+                <w:rFonts w:hint="eastAsia" w:ascii="仿宋" w:hAnsi="仿宋" w:eastAsia="仿宋"/>
+                <w:color w:val="000000" w:themeColor="text1"/>
+                <w:szCs w:val="21"/>
+              </w:rPr>
+            </w:pPr>
+            <w:r>
+              <w:rPr>
+                <w:rFonts w:hint="eastAsia" w:ascii="仿宋" w:hAnsi="仿宋" w:eastAsia="仿宋"/>
+                <w:color w:val="000000" w:themeColor="text1"/>
+                <w:szCs w:val="21"/>
+              </w:rPr>
+              <w:t xml:space="preserve">5. 上游调用开销大。若各页面实时查询识别结果，将随访问量形成对上游服务的高频重复调用。</w:t>
             </w:r>
           </w:p>
         </w:tc>
@@ -2092,196 +2294,500 @@
                 <w:color w:val="000000" w:themeColor="text1"/>
                 <w:szCs w:val="21"/>
               </w:rPr>
-              <w:t>针对现有技术的缺点和不足，阐述本发明的发明目的、解决的技术问题是什么？要达到的效果是什么？为了解决现有问题的不足，请用技术的语言简要列出本发明的设计要点，即：本方案必须具备的技术点，以及每个设计要点所起的作用和达到的效果：</w:t>
-            </w:r>
-          </w:p>
-          <w:p>
-            <w:pPr>
-              <w:rPr>
-                <w:rFonts w:hint="eastAsia" w:ascii="仿宋" w:hAnsi="仿宋" w:eastAsia="仿宋"/>
-                <w:color w:val="000000" w:themeColor="text1"/>
-                <w:szCs w:val="21"/>
-              </w:rPr>
-            </w:pPr>
-            <w:r>
-              <w:rPr>
-                <w:rFonts w:hint="eastAsia" w:ascii="仿宋" w:hAnsi="仿宋" w:eastAsia="仿宋"/>
-                <w:color w:val="000000" w:themeColor="text1"/>
-                <w:szCs w:val="21"/>
-              </w:rPr>
-              <w:t>【填写内容】</w:t>
-            </w:r>
-          </w:p>
-          <w:p>
-            <w:pPr>
-              <w:rPr>
-                <w:rFonts w:hint="eastAsia" w:ascii="仿宋" w:hAnsi="仿宋" w:eastAsia="仿宋"/>
-                <w:color w:val="000000" w:themeColor="text1"/>
-                <w:szCs w:val="21"/>
-              </w:rPr>
-            </w:pPr>
-            <w:r>
-              <w:rPr>
-                <w:rFonts w:hint="eastAsia" w:ascii="仿宋" w:hAnsi="仿宋" w:eastAsia="仿宋"/>
-                <w:color w:val="000000" w:themeColor="text1"/>
-                <w:szCs w:val="21"/>
-              </w:rPr>
-              <w:t>一、发明目的与解决的技术问题：针对现有技术中通知类任务人工判断标准不一、逐条操作效率低、图像识别结果与任务系统割裂的问题，提供一种基于图像识别结果的工地任务通知方法，将"人工逐单判断+手动提交"升级为"识别预判+自动填充+批量/自动执行+人工兜底"的自动化闭环，并解决自动化过程中的误处置、范围失控与重复执行问题。</w:t>
-            </w:r>
-          </w:p>
-          <w:p>
-            <w:pPr>
-              <w:rPr>
-                <w:rFonts w:hint="eastAsia" w:ascii="仿宋" w:hAnsi="仿宋" w:eastAsia="仿宋"/>
-                <w:color w:val="000000" w:themeColor="text1"/>
-                <w:szCs w:val="21"/>
-              </w:rPr>
-            </w:pPr>
-            <w:r>
-              <w:rPr>
-                <w:rFonts w:hint="eastAsia" w:ascii="仿宋" w:hAnsi="仿宋" w:eastAsia="仿宋"/>
-                <w:color w:val="000000" w:themeColor="text1"/>
-                <w:szCs w:val="21"/>
-              </w:rPr>
-              <w:t>二、要达到的效果：通知条件判断标准统一且判定依据（关键帧图片）随任务留证可复核；任务处理由逐条操作变为分桶批量处理；自动化范围按多级维度灰度可控、出错自动收缩；人工与自动双通道执行互斥不重复；AI建议的采纳情况可追溯，形成人机协同反馈数据。</w:t>
-            </w:r>
-          </w:p>
-          <w:p>
-            <w:pPr>
-              <w:rPr>
-                <w:rFonts w:hint="eastAsia" w:ascii="仿宋" w:hAnsi="仿宋" w:eastAsia="仿宋"/>
-                <w:color w:val="000000" w:themeColor="text1"/>
-                <w:szCs w:val="21"/>
-              </w:rPr>
-            </w:pPr>
-            <w:r>
-              <w:rPr>
-                <w:rFonts w:hint="eastAsia" w:ascii="仿宋" w:hAnsi="仿宋" w:eastAsia="仿宋"/>
-                <w:color w:val="000000" w:themeColor="text1"/>
-                <w:szCs w:val="21"/>
-              </w:rPr>
-              <w:t>三、设计要点（本方案必须具备的技术点、作用与效果）：</w:t>
-            </w:r>
-          </w:p>
-          <w:p>
-            <w:pPr>
-              <w:rPr>
-                <w:rFonts w:hint="eastAsia" w:ascii="仿宋" w:hAnsi="仿宋" w:eastAsia="仿宋"/>
-                <w:color w:val="000000" w:themeColor="text1"/>
-                <w:szCs w:val="21"/>
-              </w:rPr>
-            </w:pPr>
-            <w:r>
-              <w:rPr>
-                <w:rFonts w:hint="eastAsia" w:ascii="仿宋" w:hAnsi="仿宋" w:eastAsia="仿宋"/>
-                <w:color w:val="000000" w:themeColor="text1"/>
-                <w:szCs w:val="21"/>
-              </w:rPr>
-              <w:t>要点1 四态判定结果模型：将上游图像识别结论规约为四种互斥状态——可通知、不可通知、无法判断、现场已完成需关闭，并以结构化记录（项目标识+品类编码+任务类型+识别日期+判定结果+判定备注+关键帧图片列表+建议上门时间）落库暂存。作用：把非结构化识别输出变成任务系统可消费的确定性输入；"无法判断"态避免误处置也不埋没任务；"现场已完成需关闭"态触发任务关闭提醒，防止已完成工序继续空转考核。</w:t>
-            </w:r>
-          </w:p>
-          <w:p>
-            <w:pPr>
-              <w:rPr>
-                <w:rFonts w:hint="eastAsia" w:ascii="仿宋" w:hAnsi="仿宋" w:eastAsia="仿宋"/>
-                <w:color w:val="000000" w:themeColor="text1"/>
-                <w:szCs w:val="21"/>
-              </w:rPr>
-            </w:pPr>
-            <w:r>
-              <w:rPr>
-                <w:rFonts w:hint="eastAsia" w:ascii="仿宋" w:hAnsi="仿宋" w:eastAsia="仿宋"/>
-                <w:color w:val="000000" w:themeColor="text1"/>
-                <w:szCs w:val="21"/>
-              </w:rPr>
-              <w:t>要点2 任务节点实例表与自动化记录表的双表联动回填：任务节点实例表（含期望上门时间、现场照片、AI采纳情况、通知执行方式字段）为主数据源，自动化记录表兜底；页面填充时优先读节点字段，节点缺失时回溯查询最近一日判定记录。作用：人工修改结果（人工锚定优先）不被机器结果覆盖，同时保证无人工痕迹的任务也能获得机器预填内容。</w:t>
-            </w:r>
-          </w:p>
-          <w:p>
-            <w:pPr>
-              <w:rPr>
-                <w:rFonts w:hint="eastAsia" w:ascii="仿宋" w:hAnsi="仿宋" w:eastAsia="仿宋"/>
-                <w:color w:val="000000" w:themeColor="text1"/>
-                <w:szCs w:val="21"/>
-              </w:rPr>
-            </w:pPr>
-            <w:r>
-              <w:rPr>
-                <w:rFonts w:hint="eastAsia" w:ascii="仿宋" w:hAnsi="仿宋" w:eastAsia="仿宋"/>
-                <w:color w:val="000000" w:themeColor="text1"/>
-                <w:szCs w:val="21"/>
-              </w:rPr>
-              <w:t>要点3 多级灰度开关与失效关闭（fail-closed）策略：设置功能级开关（按城市、工程部门、作业人员标识三个集合的"或"命中关系控制功能整体放行）与品类级开关（按品类编码控制自动执行通道），配置缺失视为未命中。作用：自动化范围按组织维度与品类维度渐进放量，出错时自动收缩到安全范围，避免全量误执行。</w:t>
-            </w:r>
-          </w:p>
-          <w:p>
-            <w:pPr>
-              <w:rPr>
-                <w:rFonts w:hint="eastAsia" w:ascii="仿宋" w:hAnsi="仿宋" w:eastAsia="仿宋"/>
-                <w:color w:val="000000" w:themeColor="text1"/>
-                <w:szCs w:val="21"/>
-              </w:rPr>
-            </w:pPr>
-            <w:r>
-              <w:rPr>
-                <w:rFonts w:hint="eastAsia" w:ascii="仿宋" w:hAnsi="仿宋" w:eastAsia="仿宋"/>
-                <w:color w:val="000000" w:themeColor="text1"/>
-                <w:szCs w:val="21"/>
-              </w:rPr>
-              <w:t>要点4 基于状态字段的CAS幂等门禁：为每个任务节点设置通知执行方式字段（未执行/人工批量执行/自动执行），人工批量执行与定时自动执行两个通道在写入时均以"未执行→目标态"的条件更新（CAS）作为唯一放行门禁，更新失败即放弃执行。作用：解决人工与自动双通道并发/交叉执行同一任务的重复通知问题，保证同一任务仅被执行一次。</w:t>
-            </w:r>
-          </w:p>
-          <w:p>
-            <w:pPr>
-              <w:rPr>
-                <w:rFonts w:hint="eastAsia" w:ascii="仿宋" w:hAnsi="仿宋" w:eastAsia="仿宋"/>
-                <w:color w:val="000000" w:themeColor="text1"/>
-                <w:szCs w:val="21"/>
-              </w:rPr>
-            </w:pPr>
-            <w:r>
-              <w:rPr>
-                <w:rFonts w:hint="eastAsia" w:ascii="仿宋" w:hAnsi="仿宋" w:eastAsia="仿宋"/>
-                <w:color w:val="000000" w:themeColor="text1"/>
-                <w:szCs w:val="21"/>
-              </w:rPr>
-              <w:t>要点5 人机协同采纳反馈回写：在任务节点上记录AI建议采纳情况（采纳/未采纳/仅图片采纳/仅时间采纳），由系统对比"机器推荐内容"与"最终提交内容"的差异自动判定，并随任务执行持久化。作用：为自动化准确率提供可量化追溯数据，反哺识别与推荐策略调优，同时作为人工兜底行为的证据链。</w:t>
-            </w:r>
-          </w:p>
-          <w:p>
-            <w:pPr>
-              <w:rPr>
-                <w:rFonts w:hint="eastAsia" w:ascii="仿宋" w:hAnsi="仿宋" w:eastAsia="仿宋"/>
-                <w:color w:val="000000" w:themeColor="text1"/>
-                <w:szCs w:val="21"/>
-              </w:rPr>
-            </w:pPr>
-            <w:r>
-              <w:rPr>
-                <w:rFonts w:hint="eastAsia" w:ascii="仿宋" w:hAnsi="仿宋" w:eastAsia="仿宋"/>
-                <w:color w:val="000000" w:themeColor="text1"/>
-                <w:szCs w:val="21"/>
-              </w:rPr>
-              <w:t>要点6 分桶查询与批量执行管线：按判定结果将任务划分为"可通知桶"（判定为可通知且任务激活未完成）、"延期预警桶"（判定为不可通知/无法判断/无记录，且考核时间临近或已超期）、"现场已完成桶"（判定为需关闭）三类视图，支持按项目分组聚合、组内按考核紧迫度排序的批量查询；批量执行时逐节点携带明细（图片+时间）并行调用既有单件提交通路，单件失败不阻塞整批，已被其他路径处理的件数单独返回。作用：复用既有任务处理链路保证行为一致性，批量并行提升吞吐，结果明细保证可对账。</w:t>
-            </w:r>
-          </w:p>
-          <w:p>
-            <w:pPr>
-              <w:spacing w:line="0" w:lineRule="atLeast"/>
-              <w:ind w:firstLine="420" w:firstLineChars="200"/>
-              <w:rPr>
-                <w:rFonts w:eastAsia="黑体"/>
-                <w:color w:val="FF0000"/>
-                <w:szCs w:val="21"/>
-              </w:rPr>
-            </w:pPr>
-            <w:r>
-              <w:rPr>
-                <w:rFonts w:hint="eastAsia" w:ascii="仿宋" w:hAnsi="仿宋" w:eastAsia="仿宋"/>
-                <w:color w:val="000000" w:themeColor="text1"/>
-                <w:szCs w:val="21"/>
-              </w:rPr>
-              <w:t>要点7 轮巡暂存与时间窗触达机制：每日定时轮询最新识别结果写入缓存并预取关键帧图片，页面读取缓存不实时调用上游；摘要计数接口仅在预设时间窗内返回计数，窗口外返回零值。作用：削峰上游查询压力，避免过期摘要误导现场人员。</w:t>
+              <w:t xml:space="preserve">针对现有技术的缺点和不足，阐述本发明的发明目的、解决的技术问题是什么？要达到的效果是什么？为了解决现有问题的不足，请用技术的语言简要列出本发明的设计要点，即：本方案必须具备的技术点，以及每个设计要点所起的作用和达到的效果：</w:t>
+            </w:r>
+          </w:p>
+          <w:p>
+            <w:pPr>
+              <w:rPr>
+                <w:rFonts w:hint="eastAsia" w:ascii="仿宋" w:hAnsi="仿宋" w:eastAsia="仿宋"/>
+                <w:color w:val="000000" w:themeColor="text1"/>
+                <w:szCs w:val="21"/>
+              </w:rPr>
+            </w:pPr>
+            <w:r>
+              <w:rPr>
+                <w:rFonts w:hint="eastAsia" w:ascii="仿宋" w:hAnsi="仿宋" w:eastAsia="仿宋"/>
+                <w:color w:val="000000" w:themeColor="text1"/>
+                <w:szCs w:val="21"/>
+              </w:rPr>
+              <w:t xml:space="preserve"/>
+            </w:r>
+          </w:p>
+          <w:p>
+            <w:pPr>
+              <w:rPr>
+                <w:rFonts w:hint="eastAsia" w:ascii="仿宋" w:hAnsi="仿宋" w:eastAsia="仿宋"/>
+                <w:color w:val="000000" w:themeColor="text1"/>
+                <w:szCs w:val="21"/>
+              </w:rPr>
+            </w:pPr>
+            <w:r>
+              <w:rPr>
+                <w:rFonts w:hint="eastAsia" w:ascii="仿宋" w:hAnsi="仿宋" w:eastAsia="仿宋"/>
+                <w:color w:val="000000" w:themeColor="text1"/>
+                <w:szCs w:val="21"/>
+              </w:rPr>
+              <w:t xml:space="preserve">【填写内容】</w:t>
+            </w:r>
+          </w:p>
+          <w:p>
+            <w:pPr>
+              <w:rPr>
+                <w:rFonts w:hint="eastAsia" w:ascii="仿宋" w:hAnsi="仿宋" w:eastAsia="仿宋"/>
+                <w:color w:val="000000" w:themeColor="text1"/>
+                <w:szCs w:val="21"/>
+              </w:rPr>
+            </w:pPr>
+            <w:r>
+              <w:rPr>
+                <w:rFonts w:hint="eastAsia" w:ascii="仿宋" w:hAnsi="仿宋" w:eastAsia="仿宋"/>
+                <w:color w:val="000000" w:themeColor="text1"/>
+                <w:szCs w:val="21"/>
+              </w:rPr>
+              <w:t xml:space="preserve"/>
+            </w:r>
+          </w:p>
+          <w:p>
+            <w:pPr>
+              <w:rPr>
+                <w:rFonts w:hint="eastAsia" w:ascii="仿宋" w:hAnsi="仿宋" w:eastAsia="仿宋"/>
+                <w:color w:val="000000" w:themeColor="text1"/>
+                <w:szCs w:val="21"/>
+              </w:rPr>
+            </w:pPr>
+            <w:r>
+              <w:rPr>
+                <w:rFonts w:hint="eastAsia" w:ascii="仿宋" w:hAnsi="仿宋" w:eastAsia="仿宋"/>
+                <w:color w:val="000000" w:themeColor="text1"/>
+                <w:szCs w:val="21"/>
+              </w:rPr>
+              <w:t xml:space="preserve">一、所要解决的技术问题（对应上述缺点）：（1）识别结论与任务节点状态机之间缺少数据通路；（2）多执行通道对同一任务节点的并发写入冲突；（3）机器结果与人工结果跨数据源的一致性问题；（4）自动化执行的可控性与批量执行中的失败隔离；（5）对上游服务的重复调用开销。</w:t>
+            </w:r>
+          </w:p>
+          <w:p>
+            <w:pPr>
+              <w:rPr>
+                <w:rFonts w:hint="eastAsia" w:ascii="仿宋" w:hAnsi="仿宋" w:eastAsia="仿宋"/>
+                <w:color w:val="000000" w:themeColor="text1"/>
+                <w:szCs w:val="21"/>
+              </w:rPr>
+            </w:pPr>
+            <w:r>
+              <w:rPr>
+                <w:rFonts w:hint="eastAsia" w:ascii="仿宋" w:hAnsi="仿宋" w:eastAsia="仿宋"/>
+                <w:color w:val="000000" w:themeColor="text1"/>
+                <w:szCs w:val="21"/>
+              </w:rPr>
+              <w:t xml:space="preserve"/>
+            </w:r>
+          </w:p>
+          <w:p>
+            <w:pPr>
+              <w:rPr>
+                <w:rFonts w:hint="eastAsia" w:ascii="仿宋" w:hAnsi="仿宋" w:eastAsia="仿宋"/>
+                <w:color w:val="000000" w:themeColor="text1"/>
+                <w:szCs w:val="21"/>
+              </w:rPr>
+            </w:pPr>
+            <w:r>
+              <w:rPr>
+                <w:rFonts w:hint="eastAsia" w:ascii="仿宋" w:hAnsi="仿宋" w:eastAsia="仿宋"/>
+                <w:color w:val="000000" w:themeColor="text1"/>
+                <w:szCs w:val="21"/>
+              </w:rPr>
+              <w:t xml:space="preserve">二、技术效果（可量化）：① 同一任务节点的重复执行被拦截，重复通知执行率为零；② 对下游任务提交通路的无效重复调用次数下降；③ 对上游识别服务的日均调用次数由"随页面访问量"变为"随轮询周期"，与访问量解耦；④ 批量执行中单任务异常不影响其余任务完成，并可通过结果明细对账；⑤ 自动化放行范围可按维度分级收缩，误判影响被限制在已放行范围内。</w:t>
+            </w:r>
+          </w:p>
+          <w:p>
+            <w:pPr>
+              <w:rPr>
+                <w:rFonts w:hint="eastAsia" w:ascii="仿宋" w:hAnsi="仿宋" w:eastAsia="仿宋"/>
+                <w:color w:val="000000" w:themeColor="text1"/>
+                <w:szCs w:val="21"/>
+              </w:rPr>
+            </w:pPr>
+            <w:r>
+              <w:rPr>
+                <w:rFonts w:hint="eastAsia" w:ascii="仿宋" w:hAnsi="仿宋" w:eastAsia="仿宋"/>
+                <w:color w:val="000000" w:themeColor="text1"/>
+                <w:szCs w:val="21"/>
+              </w:rPr>
+              <w:t xml:space="preserve"/>
+            </w:r>
+          </w:p>
+          <w:p>
+            <w:pPr>
+              <w:rPr>
+                <w:rFonts w:hint="eastAsia" w:ascii="仿宋" w:hAnsi="仿宋" w:eastAsia="仿宋"/>
+                <w:color w:val="000000" w:themeColor="text1"/>
+                <w:szCs w:val="21"/>
+              </w:rPr>
+            </w:pPr>
+            <w:r>
+              <w:rPr>
+                <w:rFonts w:hint="eastAsia" w:ascii="仿宋" w:hAnsi="仿宋" w:eastAsia="仿宋"/>
+                <w:color w:val="000000" w:themeColor="text1"/>
+                <w:szCs w:val="21"/>
+              </w:rPr>
+              <w:t xml:space="preserve">三、设计要点（按上位/下位两级列出：上位对应建议的独立权利要求、下位对应从属权利要求，避免将业务规则写入独立权利要求）：</w:t>
+            </w:r>
+          </w:p>
+          <w:p>
+            <w:pPr>
+              <w:rPr>
+                <w:rFonts w:hint="eastAsia" w:ascii="仿宋" w:hAnsi="仿宋" w:eastAsia="仿宋"/>
+                <w:color w:val="000000" w:themeColor="text1"/>
+                <w:szCs w:val="21"/>
+              </w:rPr>
+            </w:pPr>
+            <w:r>
+              <w:rPr>
+                <w:rFonts w:hint="eastAsia" w:ascii="仿宋" w:hAnsi="仿宋" w:eastAsia="仿宋"/>
+                <w:color w:val="000000" w:themeColor="text1"/>
+                <w:szCs w:val="21"/>
+              </w:rPr>
+              <w:t xml:space="preserve"/>
+            </w:r>
+          </w:p>
+          <w:p>
+            <w:pPr>
+              <w:rPr>
+                <w:rFonts w:hint="eastAsia" w:ascii="仿宋" w:hAnsi="仿宋" w:eastAsia="仿宋"/>
+                <w:color w:val="000000" w:themeColor="text1"/>
+                <w:szCs w:val="21"/>
+              </w:rPr>
+            </w:pPr>
+            <w:r>
+              <w:rPr>
+                <w:rFonts w:hint="eastAsia" w:ascii="仿宋" w:hAnsi="仿宋" w:eastAsia="仿宋"/>
+                <w:color w:val="000000" w:themeColor="text1"/>
+                <w:szCs w:val="21"/>
+              </w:rPr>
+              <w:t xml:space="preserve">【要点1·上位】建立识别结论到任务节点的数据通路：接收对工地影像数据分析所得的判定结果，所述判定结果至少包括指示满足执行条件的第一状态与指示不满足执行条件的第二状态；将判定结果与任务标识、任务类型、识别时间关联后持久化为判定记录；建立判定记录与任务节点实例之间的关联关系，使判定结果成为任务节点字段填充与执行资格判定的输入。</w:t>
+            </w:r>
+          </w:p>
+          <w:p>
+            <w:pPr>
+              <w:rPr>
+                <w:rFonts w:hint="eastAsia" w:ascii="仿宋" w:hAnsi="仿宋" w:eastAsia="仿宋"/>
+                <w:color w:val="000000" w:themeColor="text1"/>
+                <w:szCs w:val="21"/>
+              </w:rPr>
+            </w:pPr>
+            <w:r>
+              <w:rPr>
+                <w:rFonts w:hint="eastAsia" w:ascii="仿宋" w:hAnsi="仿宋" w:eastAsia="仿宋"/>
+                <w:color w:val="000000" w:themeColor="text1"/>
+                <w:szCs w:val="21"/>
+              </w:rPr>
+              <w:t xml:space="preserve">作用：使识别结论可直接驱动任务节点的字段填充与执行资格判定，消除人工在系统之间搬运的环节。</w:t>
+            </w:r>
+          </w:p>
+          <w:p>
+            <w:pPr>
+              <w:rPr>
+                <w:rFonts w:hint="eastAsia" w:ascii="仿宋" w:hAnsi="仿宋" w:eastAsia="仿宋"/>
+                <w:color w:val="000000" w:themeColor="text1"/>
+                <w:szCs w:val="21"/>
+              </w:rPr>
+            </w:pPr>
+            <w:r>
+              <w:rPr>
+                <w:rFonts w:hint="eastAsia" w:ascii="仿宋" w:hAnsi="仿宋" w:eastAsia="仿宋"/>
+                <w:color w:val="000000" w:themeColor="text1"/>
+                <w:szCs w:val="21"/>
+              </w:rPr>
+              <w:t xml:space="preserve"/>
+            </w:r>
+          </w:p>
+          <w:p>
+            <w:pPr>
+              <w:rPr>
+                <w:rFonts w:hint="eastAsia" w:ascii="仿宋" w:hAnsi="仿宋" w:eastAsia="仿宋"/>
+                <w:color w:val="000000" w:themeColor="text1"/>
+                <w:szCs w:val="21"/>
+              </w:rPr>
+            </w:pPr>
+            <w:r>
+              <w:rPr>
+                <w:rFonts w:hint="eastAsia" w:ascii="仿宋" w:hAnsi="仿宋" w:eastAsia="仿宋"/>
+                <w:color w:val="000000" w:themeColor="text1"/>
+                <w:szCs w:val="21"/>
+              </w:rPr>
+              <w:t xml:space="preserve">【要点2·上位】以状态字段为唯一竞争资源的多通道互斥执行：在任务节点实例上设置执行状态字段；人工批量执行通道与定时自动执行通道在写入前，均以"未执行态→目标态"的条件更新判定执行资格，条件更新失败者判定为已被其他通道执行并放弃该任务；条件更新成功者并行调用同一条任务提交通路，单项异常被执行隔离而不阻塞其余项。</w:t>
+            </w:r>
+          </w:p>
+          <w:p>
+            <w:pPr>
+              <w:rPr>
+                <w:rFonts w:hint="eastAsia" w:ascii="仿宋" w:hAnsi="仿宋" w:eastAsia="仿宋"/>
+                <w:color w:val="000000" w:themeColor="text1"/>
+                <w:szCs w:val="21"/>
+              </w:rPr>
+            </w:pPr>
+            <w:r>
+              <w:rPr>
+                <w:rFonts w:hint="eastAsia" w:ascii="仿宋" w:hAnsi="仿宋" w:eastAsia="仿宋"/>
+                <w:color w:val="000000" w:themeColor="text1"/>
+                <w:szCs w:val="21"/>
+              </w:rPr>
+              <w:t xml:space="preserve">作用：解决多通道并发写入同一任务节点导致的重复执行问题；复用同一条提交通路保证行为一致，并行执行提升吞吐，失败隔离保证批量可用性。</w:t>
+            </w:r>
+          </w:p>
+          <w:p>
+            <w:pPr>
+              <w:rPr>
+                <w:rFonts w:hint="eastAsia" w:ascii="仿宋" w:hAnsi="仿宋" w:eastAsia="仿宋"/>
+                <w:color w:val="000000" w:themeColor="text1"/>
+                <w:szCs w:val="21"/>
+              </w:rPr>
+            </w:pPr>
+            <w:r>
+              <w:rPr>
+                <w:rFonts w:hint="eastAsia" w:ascii="仿宋" w:hAnsi="仿宋" w:eastAsia="仿宋"/>
+                <w:color w:val="000000" w:themeColor="text1"/>
+                <w:szCs w:val="21"/>
+              </w:rPr>
+              <w:t xml:space="preserve"/>
+            </w:r>
+          </w:p>
+          <w:p>
+            <w:pPr>
+              <w:rPr>
+                <w:rFonts w:hint="eastAsia" w:ascii="仿宋" w:hAnsi="仿宋" w:eastAsia="仿宋"/>
+                <w:color w:val="000000" w:themeColor="text1"/>
+                <w:szCs w:val="21"/>
+              </w:rPr>
+            </w:pPr>
+            <w:r>
+              <w:rPr>
+                <w:rFonts w:hint="eastAsia" w:ascii="仿宋" w:hAnsi="仿宋" w:eastAsia="仿宋"/>
+                <w:color w:val="000000" w:themeColor="text1"/>
+                <w:szCs w:val="21"/>
+              </w:rPr>
+              <w:t xml:space="preserve">【要点3·下位】判定结果采用多态集合，除第一、第二状态外还包括"无法判断"状态与"现场已完成"状态，并设置差异化处置分支：第一状态进入可执行集合并具备自动执行资格；第二状态与无法判断状态进入预警集合，且无法判断状态禁止进入自动执行；现场已完成状态触发关闭提醒并禁止进入自动执行。</w:t>
+            </w:r>
+          </w:p>
+          <w:p>
+            <w:pPr>
+              <w:rPr>
+                <w:rFonts w:hint="eastAsia" w:ascii="仿宋" w:hAnsi="仿宋" w:eastAsia="仿宋"/>
+                <w:color w:val="000000" w:themeColor="text1"/>
+                <w:szCs w:val="21"/>
+              </w:rPr>
+            </w:pPr>
+            <w:r>
+              <w:rPr>
+                <w:rFonts w:hint="eastAsia" w:ascii="仿宋" w:hAnsi="仿宋" w:eastAsia="仿宋"/>
+                <w:color w:val="000000" w:themeColor="text1"/>
+                <w:szCs w:val="21"/>
+              </w:rPr>
+              <w:t xml:space="preserve">作用：避免误判被直接执行，同时不埋没任务；已完成任务及时退出考核，避免无效流转。</w:t>
+            </w:r>
+          </w:p>
+          <w:p>
+            <w:pPr>
+              <w:rPr>
+                <w:rFonts w:hint="eastAsia" w:ascii="仿宋" w:hAnsi="仿宋" w:eastAsia="仿宋"/>
+                <w:color w:val="000000" w:themeColor="text1"/>
+                <w:szCs w:val="21"/>
+              </w:rPr>
+            </w:pPr>
+            <w:r>
+              <w:rPr>
+                <w:rFonts w:hint="eastAsia" w:ascii="仿宋" w:hAnsi="仿宋" w:eastAsia="仿宋"/>
+                <w:color w:val="000000" w:themeColor="text1"/>
+                <w:szCs w:val="21"/>
+              </w:rPr>
+              <w:t xml:space="preserve"/>
+            </w:r>
+          </w:p>
+          <w:p>
+            <w:pPr>
+              <w:rPr>
+                <w:rFonts w:hint="eastAsia" w:ascii="仿宋" w:hAnsi="仿宋" w:eastAsia="仿宋"/>
+                <w:color w:val="000000" w:themeColor="text1"/>
+                <w:szCs w:val="21"/>
+              </w:rPr>
+            </w:pPr>
+            <w:r>
+              <w:rPr>
+                <w:rFonts w:hint="eastAsia" w:ascii="仿宋" w:hAnsi="仿宋" w:eastAsia="仿宋"/>
+                <w:color w:val="000000" w:themeColor="text1"/>
+                <w:szCs w:val="21"/>
+              </w:rPr>
+              <w:t xml:space="preserve">【要点4·下位】主数据源优先、次级数据源回退的跨源回填策略：读取时优先采用任务节点实例中的字段值（人工修改结果作为锚定值），该字段缺失时回退读取判定记录中最近一次的有效值；用户修改后的值回写至任务节点实例。</w:t>
+            </w:r>
+          </w:p>
+          <w:p>
+            <w:pPr>
+              <w:rPr>
+                <w:rFonts w:hint="eastAsia" w:ascii="仿宋" w:hAnsi="仿宋" w:eastAsia="仿宋"/>
+                <w:color w:val="000000" w:themeColor="text1"/>
+                <w:szCs w:val="21"/>
+              </w:rPr>
+            </w:pPr>
+            <w:r>
+              <w:rPr>
+                <w:rFonts w:hint="eastAsia" w:ascii="仿宋" w:hAnsi="仿宋" w:eastAsia="仿宋"/>
+                <w:color w:val="000000" w:themeColor="text1"/>
+                <w:szCs w:val="21"/>
+              </w:rPr>
+              <w:t xml:space="preserve">作用：机器结果不覆盖人工修改结果，且无人工修改的任务同样可获得机器预填内容。</w:t>
+            </w:r>
+          </w:p>
+          <w:p>
+            <w:pPr>
+              <w:rPr>
+                <w:rFonts w:hint="eastAsia" w:ascii="仿宋" w:hAnsi="仿宋" w:eastAsia="仿宋"/>
+                <w:color w:val="000000" w:themeColor="text1"/>
+                <w:szCs w:val="21"/>
+              </w:rPr>
+            </w:pPr>
+            <w:r>
+              <w:rPr>
+                <w:rFonts w:hint="eastAsia" w:ascii="仿宋" w:hAnsi="仿宋" w:eastAsia="仿宋"/>
+                <w:color w:val="000000" w:themeColor="text1"/>
+                <w:szCs w:val="21"/>
+              </w:rPr>
+              <w:t xml:space="preserve"/>
+            </w:r>
+          </w:p>
+          <w:p>
+            <w:pPr>
+              <w:rPr>
+                <w:rFonts w:hint="eastAsia" w:ascii="仿宋" w:hAnsi="仿宋" w:eastAsia="仿宋"/>
+                <w:color w:val="000000" w:themeColor="text1"/>
+                <w:szCs w:val="21"/>
+              </w:rPr>
+            </w:pPr>
+            <w:r>
+              <w:rPr>
+                <w:rFonts w:hint="eastAsia" w:ascii="仿宋" w:hAnsi="仿宋" w:eastAsia="仿宋"/>
+                <w:color w:val="000000" w:themeColor="text1"/>
+                <w:szCs w:val="21"/>
+              </w:rPr>
+              <w:t xml:space="preserve">【要点5·下位】分级放行开关与失效关闭策略：以组织维度集合的或命中关系控制功能整体放行，以品类集合控制自动执行通道的准入；开关配置缺失时视为未命中，相关接口返回空结果。</w:t>
+            </w:r>
+          </w:p>
+          <w:p>
+            <w:pPr>
+              <w:rPr>
+                <w:rFonts w:hint="eastAsia" w:ascii="仿宋" w:hAnsi="仿宋" w:eastAsia="仿宋"/>
+                <w:color w:val="000000" w:themeColor="text1"/>
+                <w:szCs w:val="21"/>
+              </w:rPr>
+            </w:pPr>
+            <w:r>
+              <w:rPr>
+                <w:rFonts w:hint="eastAsia" w:ascii="仿宋" w:hAnsi="仿宋" w:eastAsia="仿宋"/>
+                <w:color w:val="000000" w:themeColor="text1"/>
+                <w:szCs w:val="21"/>
+              </w:rPr>
+              <w:t xml:space="preserve">作用：自动化的影响范围可按维度渐进放开，配置异常时自动收缩至不生效的安全状态。</w:t>
+            </w:r>
+          </w:p>
+          <w:p>
+            <w:pPr>
+              <w:rPr>
+                <w:rFonts w:hint="eastAsia" w:ascii="仿宋" w:hAnsi="仿宋" w:eastAsia="仿宋"/>
+                <w:color w:val="000000" w:themeColor="text1"/>
+                <w:szCs w:val="21"/>
+              </w:rPr>
+            </w:pPr>
+            <w:r>
+              <w:rPr>
+                <w:rFonts w:hint="eastAsia" w:ascii="仿宋" w:hAnsi="仿宋" w:eastAsia="仿宋"/>
+                <w:color w:val="000000" w:themeColor="text1"/>
+                <w:szCs w:val="21"/>
+              </w:rPr>
+              <w:t xml:space="preserve"/>
+            </w:r>
+          </w:p>
+          <w:p>
+            <w:pPr>
+              <w:rPr>
+                <w:rFonts w:hint="eastAsia" w:ascii="仿宋" w:hAnsi="仿宋" w:eastAsia="仿宋"/>
+                <w:color w:val="000000" w:themeColor="text1"/>
+                <w:szCs w:val="21"/>
+              </w:rPr>
+            </w:pPr>
+            <w:r>
+              <w:rPr>
+                <w:rFonts w:hint="eastAsia" w:ascii="仿宋" w:hAnsi="仿宋" w:eastAsia="仿宋"/>
+                <w:color w:val="000000" w:themeColor="text1"/>
+                <w:szCs w:val="21"/>
+              </w:rPr>
+              <w:t xml:space="preserve">【要点6·下位】采纳情况的自动判定与回写，并据此调整放行范围：任务执行时比对判定记录中的推荐内容（推荐上门时间、关键帧图片）与任务节点上最终提交的内容，按以下规则自动归类——内容完全一致记为采纳；仅图片一致记为图片采纳；仅时间一致记为时间采纳；均不一致记为未采纳；将归类结果写入任务节点的采纳字段持久化，并作为后续自动执行准入范围（按品类）的调整依据。</w:t>
+            </w:r>
+          </w:p>
+          <w:p>
+            <w:pPr>
+              <w:rPr>
+                <w:rFonts w:hint="eastAsia" w:ascii="仿宋" w:hAnsi="仿宋" w:eastAsia="仿宋"/>
+                <w:color w:val="000000" w:themeColor="text1"/>
+                <w:szCs w:val="21"/>
+              </w:rPr>
+            </w:pPr>
+            <w:r>
+              <w:rPr>
+                <w:rFonts w:hint="eastAsia" w:ascii="仿宋" w:hAnsi="仿宋" w:eastAsia="仿宋"/>
+                <w:color w:val="000000" w:themeColor="text1"/>
+                <w:szCs w:val="21"/>
+              </w:rPr>
+              <w:t xml:space="preserve">作用：为自动化准确度提供可追溯的量化依据，并形成"判定—执行—采纳—调整准入"的自适应闭环。</w:t>
+            </w:r>
+          </w:p>
+          <w:p>
+            <w:pPr>
+              <w:rPr>
+                <w:rFonts w:hint="eastAsia" w:ascii="仿宋" w:hAnsi="仿宋" w:eastAsia="仿宋"/>
+                <w:color w:val="000000" w:themeColor="text1"/>
+                <w:szCs w:val="21"/>
+              </w:rPr>
+            </w:pPr>
+            <w:r>
+              <w:rPr>
+                <w:rFonts w:hint="eastAsia" w:ascii="仿宋" w:hAnsi="仿宋" w:eastAsia="仿宋"/>
+                <w:color w:val="000000" w:themeColor="text1"/>
+                <w:szCs w:val="21"/>
+              </w:rPr>
+              <w:t xml:space="preserve"/>
+            </w:r>
+          </w:p>
+          <w:p>
+            <w:pPr>
+              <w:rPr>
+                <w:rFonts w:hint="eastAsia" w:ascii="仿宋" w:hAnsi="仿宋" w:eastAsia="仿宋"/>
+                <w:color w:val="000000" w:themeColor="text1"/>
+                <w:szCs w:val="21"/>
+              </w:rPr>
+            </w:pPr>
+            <w:r>
+              <w:rPr>
+                <w:rFonts w:hint="eastAsia" w:ascii="仿宋" w:hAnsi="仿宋" w:eastAsia="仿宋"/>
+                <w:color w:val="000000" w:themeColor="text1"/>
+                <w:szCs w:val="21"/>
+              </w:rPr>
+              <w:t xml:space="preserve">【要点7·下位】轮询暂存与时间窗触达：按固定周期轮询最新判定结果并写入缓存、同时预取关键帧图片，页面侧读取缓存；摘要计数接口仅在预设时间窗内返回计数，窗口外返回零值。</w:t>
+            </w:r>
+          </w:p>
+          <w:p>
+            <w:pPr>
+              <w:rPr>
+                <w:rFonts w:hint="eastAsia" w:ascii="仿宋" w:hAnsi="仿宋" w:eastAsia="仿宋"/>
+                <w:color w:val="000000" w:themeColor="text1"/>
+                <w:szCs w:val="21"/>
+              </w:rPr>
+            </w:pPr>
+            <w:r>
+              <w:rPr>
+                <w:rFonts w:hint="eastAsia" w:ascii="仿宋" w:hAnsi="仿宋" w:eastAsia="仿宋"/>
+                <w:color w:val="000000" w:themeColor="text1"/>
+                <w:szCs w:val="21"/>
+              </w:rPr>
+              <w:t xml:space="preserve">作用：降低对上游识别服务的调用频次，并避免过期摘要信息造成误操作。</w:t>
             </w:r>
           </w:p>
         </w:tc>
@@ -2377,7 +2883,7 @@
                 <w:color w:val="FF0000"/>
                 <w:szCs w:val="21"/>
               </w:rPr>
-              <w:t>结合具体实施例和附图，完整、清楚地写出本发明要实现上述发明目的的具体技术方案，使本领域的普通技术人员能够理解该技术方案，并能按照该技术方案实现本发明的发明目的。本部分非常重要，这是发明专利的核心部分。对于一种XXX装置的专利申请来说，要结合图纸详细说明构成本发明XXX装置都有哪些部分？各部分的连接关系？位置关系？实现发明目的的工作原理。对于一种XXX方法的专利申请来说，要结合反映该方法的程序框图、按照时间顺序详细说明具体的实现步骤，使同领域的普通技术人员能够按照您的说明，将该发明或者实用新型再现出来。</w:t>
+              <w:t xml:space="preserve">结合具体实施例和附图，完整、清楚地写出本发明要实现上述发明目的的具体技术方案，使本领域的普通技术人员能够理解该技术方案，并能按照该技术方案实现本发明的发明目的。本部分非常重要，这是发明专利的核心部分。对于一种XXX装置的专利申请来说，要结合图纸详细说明构成本发明XXX装置都有哪些部分？各部分的连接关系？位置关系？实现发明目的的工作原理。对于一种XXX方法的专利申请来说，要结合反映该方法的程序框图、按照时间顺序详细说明具体的实现步骤，使同领域的普通技术人员能够按照您的说明，将该发明或者实用新型再现出来。</w:t>
             </w:r>
           </w:p>
           <w:p>
@@ -2394,7 +2900,7 @@
                 <w:color w:val="FF0000"/>
                 <w:szCs w:val="21"/>
               </w:rPr>
-              <w:t>【填写内容】</w:t>
+              <w:t xml:space="preserve"/>
             </w:r>
           </w:p>
           <w:p>
@@ -2411,7 +2917,7 @@
                 <w:color w:val="FF0000"/>
                 <w:szCs w:val="21"/>
               </w:rPr>
-              <w:t>一、系统总体结构（对应附图建议图1）：本实施例的系统包括：识别结果接入模块（接收上游识别服务对工地摄像头视频与工人上传照片进行分析后批量回调的判定结果，校验后落库暂存）；任务节点数据模块（维护任务调度节点实例表，每个节点对应一道工序的执行状态、期望上门时间、现场照片、执行方式与AI采纳情况）；自动化记录模块（维护主材通知任务自动化记录表，存储每次识别的判定明细）；查询触达模块（按判定结果分桶的批量查询、摘要计数与页面自动填充）；执行模块（人工批量一键执行通道与定时自动执行通道，两通道经CAS门禁互斥）；配置模块（多级灰度开关，失效关闭策略）。</w:t>
+              <w:t xml:space="preserve">【填写内容】</w:t>
             </w:r>
           </w:p>
           <w:p>
@@ -2428,7 +2934,7 @@
                 <w:color w:val="FF0000"/>
                 <w:szCs w:val="21"/>
               </w:rPr>
-              <w:t>二、数据结构：表1 主材通知任务自动化记录表（每维度每日追加一条，只增不改）：project_order_id（项目订单标识，BIGINT）、material_code（品类编码）、task_type（任务类型：通知复尺/通知安装/通知送货等）、judge_result（判定结果：0-未判定，1-可通知，2-不可通知，3-无法判断，4-现场已完成需关闭）、judge_remark（判定备注，含不满足项说明）、images（关键帧图片地址，逗号分隔）、recognize_time（识别日期）、recommend_visit_time（建议上门时间）、notify_execute_type（通知执行方式：0-未执行，1-一键通知即人工批量，2-自动通知）、ai_adoption_type（AI建议采纳情况：0-未处理，1-采纳，2-未采纳，3-图片采纳，4-上门时间采纳）；索引（project_order_id, task_type, material_code）。表2 任务节点实例表扩展字段（在既有任务调度节点表上新增）：ai_adoption_type（AI建议采纳情况，同上枚举）、notify_execute_type（通知执行方式，同上枚举）；既有字段（期望上门时间、现场照片、考核时间、处理状态等）构成人工锚定数据。</w:t>
+              <w:t xml:space="preserve"/>
             </w:r>
           </w:p>
           <w:p>
@@ -2445,7 +2951,7 @@
                 <w:color w:val="FF0000"/>
                 <w:szCs w:val="21"/>
               </w:rPr>
-              <w:t>三、主要流程（按时间顺序，对应附图建议图2-图5）：</w:t>
+              <w:t xml:space="preserve">一、系统总体结构（见图1）：本实施例的系统包括——识别结果接入模块，接收上游识别服务对工地视频与现场照片进行分析后批量回调的判定结果，执行字段校验后写入判定记录表；任务节点数据模块，维护任务节点实例表，每个节点对应一道工序的执行状态、期望上门时间、现场照片、执行状态字段与采纳字段；查询触达模块，按判定状态进行集合归属判定并提供批量查询、摘要计数与页面内容填充；执行模块，包含人工批量执行通道与定时自动执行通道，二者经同一状态字段的条件更新互斥；配置模块，维护分级放行开关并采用失效关闭策略。</w:t>
             </w:r>
           </w:p>
           <w:p>
@@ -2462,7 +2968,7 @@
                 <w:color w:val="FF0000"/>
                 <w:szCs w:val="21"/>
               </w:rPr>
-              <w:t>步骤S1 识别结果接入：上游识别服务按八项必填字段（项目标识+品类编码+任务类型+识别日期+判定结果+判定备注+图片列表+建议上门时间）批量回调；接入模块逐项校验（含图片列表空元素剔除），校验通过后写入自动化记录表，同维度每日一条追加；执行方式与采纳字段初始化为未处理态。</w:t>
+              <w:t xml:space="preserve"/>
             </w:r>
           </w:p>
           <w:p>
@@ -2479,7 +2985,7 @@
                 <w:color w:val="FF0000"/>
                 <w:szCs w:val="21"/>
               </w:rPr>
-              <w:t>步骤S2 分桶查询：查询模块以作业人员标识为入口，取其名下全部"激活未完成"的任务节点，与自动化记录表按（项目、品类、任务类型、最近识别日期）关联：判定为"可通知"的进入可通知桶（页面展示建议上门时间，支持修改，与判定关键帧，默认三张可展开，按项目分组、组内按考核时间升序）；判定为"不可通知/无法判断"或无识别记录、且考核时间与当前时间差值不超过阈值（如3天）或已超期的进入延期预警桶，未经系统判定的任务同样露出；判定为"现场已完成需关闭"的进入现场已完成桶，触发面向作业人员的关闭提醒推送。</w:t>
+              <w:t xml:space="preserve">二、数据结构：</w:t>
             </w:r>
           </w:p>
           <w:p>
@@ -2496,7 +3002,7 @@
                 <w:color w:val="FF0000"/>
                 <w:szCs w:val="21"/>
               </w:rPr>
-              <w:t>步骤S3 页面自动填充（双表联动）：进入通知页面时优先读取任务节点实例表中的期望上门时间与图片（人工锚定优先）；节点缺失图片或时间时，回溯自动化记录表最近一日判定行兜底填充。灰度开关未命中时填充接口返回空对象（失效关闭）。用户修改后的时间与图片回写暂存，供后续执行使用。</w:t>
+              <w:t xml:space="preserve"/>
             </w:r>
           </w:p>
           <w:p>
@@ -2513,7 +3019,7 @@
                 <w:color w:val="FF0000"/>
                 <w:szCs w:val="21"/>
               </w:rPr>
-              <w:t>步骤S4 人工批量一键执行：用户在可通知桶勾选多个任务后一键提交；执行模块对每个任务节点以"通知执行方式=未执行"为条件执行CAS更新（未执行→一键通知），更新成功者携带各自明细（图片+期望上门时间）并行调用既有的单件任务提交通路（复用原有状态流转、下游通知、节点推进逻辑），单件异常不阻塞整批；CAS失败者（已被其他路径处理）单独计数返回。同时记录本次操作涉及全部任务（含勾选与未勾选项）的操作快照，供事后追溯。</w:t>
+              <w:t xml:space="preserve">表1 判定记录表（同一任务同一识别日仅保留一条，只增不改）：任务标识、任务类型、判定状态、判定备注、关键帧图片地址列表、识别日期、推荐上门时间、执行状态、采纳情况；索引为（任务标识、任务类型、品类编码）。</w:t>
             </w:r>
           </w:p>
           <w:p>
@@ -2530,7 +3036,7 @@
                 <w:color w:val="FF0000"/>
                 <w:szCs w:val="21"/>
               </w:rPr>
-              <w:t>步骤S5 定时自动执行：定时任务扫描自动化记录表中"判定=可通知 且 执行方式=未执行 且 识别日期=昨日"的候选；对每个候选先经品类级开关过滤，再按（项目+品类）反查任务节点并去重；以"执行方式=未执行→自动通知"的CAS更新作为放行门禁，成功后调用与S4相同的单件提交通路完成通知；返回候选数、执行数、跳过数、失败数四项指标。</w:t>
+              <w:t xml:space="preserve"/>
             </w:r>
           </w:p>
           <w:p>
@@ -2547,7 +3053,7 @@
                 <w:color w:val="FF0000"/>
                 <w:szCs w:val="21"/>
               </w:rPr>
-              <w:t>步骤S6 采纳反馈回写：任务执行时对比机器推荐内容（自动化记录表中的建议上门时间与关键帧）与最终提交内容（节点实际提交的时间与图片）的差异，自动判定采纳情况（全部一致-采纳；均不一致-未采纳；仅图片一致-图片采纳；仅时间一致-时间采纳），写入任务节点的AI采纳字段，随任务实例持久化。</w:t>
+              <w:t xml:space="preserve">表2 任务节点实例表（在既有任务调度节点表上扩展）：新增采纳情况字段与执行状态字段；既有字段（期望上门时间、现场照片、考核时间、处理状态）构成人工锚定的数据来源。执行状态字段取值为未执行、人工批量执行、自动执行，该字段同时作为两个执行通道的唯一竞争资源与执行结果的判定依据。</w:t>
             </w:r>
           </w:p>
           <w:p>
@@ -2564,7 +3070,7 @@
                 <w:color w:val="FF0000"/>
                 <w:szCs w:val="21"/>
               </w:rPr>
-              <w:t>步骤S7 轮巡暂存与时间窗触达：每日固定时刻（如09:10）轮询全部最新识别结果写入缓存并预取关键帧图片，各页面读缓存；摘要计数接口仅在预设时间窗（如09:10-10:00、13:00-14:00、19:00-21:00）内返回"可通知n个、延期m个"计数，窗口外返回零值；每日轮巡发现"现场已完成需关闭"任务时向对应作业人员推送关闭提醒。</w:t>
+              <w:t xml:space="preserve"/>
             </w:r>
           </w:p>
           <w:p>
@@ -2581,13 +3087,14 @@
                 <w:color w:val="FF0000"/>
                 <w:szCs w:val="21"/>
               </w:rPr>
-              <w:t>四、实施效果：通知条件判断由人工经验判断变为统一的结构化四态判定，判定依据随任务留证可复核；逐条手动提交变为分桶批量一键执行，处理成本随任务数的增长由线性人工操作降为一次批量操作；灰度开关支持按城市/工程部门/作业人员/品类渐进放量，配置缺失自动失效关闭；CAS门禁保证人工与自动双通道对同一任务互斥执行，杜绝重复通知；AI采纳字段沉淀人机协同数据，可统计自动化建议采纳率并反哺识别策略。</w:t>
-            </w:r>
-          </w:p>
-          <w:p>
-            <w:pPr>
-              <w:rPr>
-                <w:rFonts w:ascii="仿宋" w:hAnsi="仿宋" w:eastAsia="仿宋"/>
+              <w:t xml:space="preserve">三、主要流程（按时间顺序，见图2、图3）：</w:t>
+            </w:r>
+          </w:p>
+          <w:p>
+            <w:pPr>
+              <w:rPr>
+                <w:rFonts w:eastAsia="黑体"/>
+                <w:color w:val="FF0000"/>
                 <w:szCs w:val="21"/>
               </w:rPr>
             </w:pPr>
@@ -2597,7 +3104,432 @@
                 <w:color w:val="FF0000"/>
                 <w:szCs w:val="21"/>
               </w:rPr>
-              <w:t>五、附图建议（供代理人绘制正式附图参考）：图1系统总体架构图；图2四态判定结果分桶处置流程图（S1-S2）；图3双表联动的自动填充与人工批量执行时序图（S3-S4）；图4定时自动执行与CAS幂等门禁流程图（S5）；图5人机协同采纳反馈回写示意图（S6）。</w:t>
+              <w:t xml:space="preserve"/>
+            </w:r>
+          </w:p>
+          <w:p>
+            <w:pPr>
+              <w:rPr>
+                <w:rFonts w:eastAsia="黑体"/>
+                <w:color w:val="FF0000"/>
+                <w:szCs w:val="21"/>
+              </w:rPr>
+            </w:pPr>
+            <w:r>
+              <w:rPr>
+                <w:rFonts w:hint="eastAsia" w:eastAsia="黑体"/>
+                <w:color w:val="FF0000"/>
+                <w:szCs w:val="21"/>
+              </w:rPr>
+              <w:t xml:space="preserve">步骤S1 判定结果接入：上游识别服务按预设字段集（任务标识、品类编码、任务类型、识别日期、判定状态、判定备注、图片列表、推荐上门时间）批量回调；接入模块逐项校验（字段完整性、图片列表中的空元素剔除、日期格式），校验通过后写入判定记录表，同一任务同一识别日仅保留一条；执行状态与采纳情况初始化为未处理。</w:t>
+            </w:r>
+          </w:p>
+          <w:p>
+            <w:pPr>
+              <w:rPr>
+                <w:rFonts w:eastAsia="黑体"/>
+                <w:color w:val="FF0000"/>
+                <w:szCs w:val="21"/>
+              </w:rPr>
+            </w:pPr>
+            <w:r>
+              <w:rPr>
+                <w:rFonts w:hint="eastAsia" w:eastAsia="黑体"/>
+                <w:color w:val="FF0000"/>
+                <w:szCs w:val="21"/>
+              </w:rPr>
+              <w:t xml:space="preserve"/>
+            </w:r>
+          </w:p>
+          <w:p>
+            <w:pPr>
+              <w:rPr>
+                <w:rFonts w:eastAsia="黑体"/>
+                <w:color w:val="FF0000"/>
+                <w:szCs w:val="21"/>
+              </w:rPr>
+            </w:pPr>
+            <w:r>
+              <w:rPr>
+                <w:rFonts w:hint="eastAsia" w:eastAsia="黑体"/>
+                <w:color w:val="FF0000"/>
+                <w:szCs w:val="21"/>
+              </w:rPr>
+              <w:t xml:space="preserve">步骤S2 分态映射与分类查询：查询模块以作业人员标识为入口，取其名下全部处于可执行处理状态的任务节点，与判定记录按（任务标识、品类编码、任务类型、最近识别日期）关联，并按判定状态归属集合：判定为第一状态者进入可执行集合，页面展示推荐上门时间（允许修改）与关键帧图片（默认展示三张、可展开），按工地分组、组内按考核时间升序排列；判定为第二状态、无法判断状态或无判定记录、且考核时间与当前时间的差值不超过预设阈值或已超期者进入预警集合；判定为现场已完成者进入已完成集合，触发关闭提醒推送。所述阈值可根据考核周期设置，本实施例优选为3天。</w:t>
+            </w:r>
+          </w:p>
+          <w:p>
+            <w:pPr>
+              <w:rPr>
+                <w:rFonts w:eastAsia="黑体"/>
+                <w:color w:val="FF0000"/>
+                <w:szCs w:val="21"/>
+              </w:rPr>
+            </w:pPr>
+            <w:r>
+              <w:rPr>
+                <w:rFonts w:hint="eastAsia" w:eastAsia="黑体"/>
+                <w:color w:val="FF0000"/>
+                <w:szCs w:val="21"/>
+              </w:rPr>
+              <w:t xml:space="preserve"/>
+            </w:r>
+          </w:p>
+          <w:p>
+            <w:pPr>
+              <w:rPr>
+                <w:rFonts w:eastAsia="黑体"/>
+                <w:color w:val="FF0000"/>
+                <w:szCs w:val="21"/>
+              </w:rPr>
+            </w:pPr>
+            <w:r>
+              <w:rPr>
+                <w:rFonts w:hint="eastAsia" w:eastAsia="黑体"/>
+                <w:color w:val="FF0000"/>
+                <w:szCs w:val="21"/>
+              </w:rPr>
+              <w:t xml:space="preserve">步骤S3 跨源回填（见图4）：进入通知页面时优先读取任务节点实例表中的期望上门时间与图片（人工修改结果作为锚定值）；该字段缺失时，回退读取判定记录表中最近一次的有效值进行填充。放行开关未命中时填充结果为空。用户修改后的时间与图片回写至任务节点实例，供后续执行使用。</w:t>
+            </w:r>
+          </w:p>
+          <w:p>
+            <w:pPr>
+              <w:rPr>
+                <w:rFonts w:eastAsia="黑体"/>
+                <w:color w:val="FF0000"/>
+                <w:szCs w:val="21"/>
+              </w:rPr>
+            </w:pPr>
+            <w:r>
+              <w:rPr>
+                <w:rFonts w:hint="eastAsia" w:eastAsia="黑体"/>
+                <w:color w:val="FF0000"/>
+                <w:szCs w:val="21"/>
+              </w:rPr>
+              <w:t xml:space="preserve"/>
+            </w:r>
+          </w:p>
+          <w:p>
+            <w:pPr>
+              <w:rPr>
+                <w:rFonts w:eastAsia="黑体"/>
+                <w:color w:val="FF0000"/>
+                <w:szCs w:val="21"/>
+              </w:rPr>
+            </w:pPr>
+            <w:r>
+              <w:rPr>
+                <w:rFonts w:hint="eastAsia" w:eastAsia="黑体"/>
+                <w:color w:val="FF0000"/>
+                <w:szCs w:val="21"/>
+              </w:rPr>
+              <w:t xml:space="preserve">步骤S4 人工批量执行：用户在可执行集合中选取多个任务后批量提交；执行模块对每个任务节点以"执行状态=未执行"为条件执行条件更新（未执行→人工批量执行），更新成功者携带各自明细（图片、期望上门时间）并行调用同一条任务提交通路（复用既有的状态流转、下游通知与节点推进逻辑），单项异常被执行隔离、不阻塞其余项；更新失败者（已被其他通道执行）单独计数返回。同时记录本次操作涉及的全部任务（含被选取与未被选取项）作为操作快照，供事后追溯。</w:t>
+            </w:r>
+          </w:p>
+          <w:p>
+            <w:pPr>
+              <w:rPr>
+                <w:rFonts w:eastAsia="黑体"/>
+                <w:color w:val="FF0000"/>
+                <w:szCs w:val="21"/>
+              </w:rPr>
+            </w:pPr>
+            <w:r>
+              <w:rPr>
+                <w:rFonts w:hint="eastAsia" w:eastAsia="黑体"/>
+                <w:color w:val="FF0000"/>
+                <w:szCs w:val="21"/>
+              </w:rPr>
+              <w:t xml:space="preserve"/>
+            </w:r>
+          </w:p>
+          <w:p>
+            <w:pPr>
+              <w:rPr>
+                <w:rFonts w:eastAsia="黑体"/>
+                <w:color w:val="FF0000"/>
+                <w:szCs w:val="21"/>
+              </w:rPr>
+            </w:pPr>
+            <w:r>
+              <w:rPr>
+                <w:rFonts w:hint="eastAsia" w:eastAsia="黑体"/>
+                <w:color w:val="FF0000"/>
+                <w:szCs w:val="21"/>
+              </w:rPr>
+              <w:t xml:space="preserve">步骤S5 定时自动执行：定时任务扫描判定记录表中"判定状态为第一状态、执行状态为未执行、识别日期为前一自然日"的候选；对每个候选先经品类级开关过滤，再按（任务标识、品类编码）反查任务节点并去重；以"执行状态=未执行→自动执行"的条件更新作为放行门禁，成功后调用与步骤S4相同的任务提交通路完成通知；返回候选数、执行数、跳过数、失败数四项指标。</w:t>
+            </w:r>
+          </w:p>
+          <w:p>
+            <w:pPr>
+              <w:rPr>
+                <w:rFonts w:eastAsia="黑体"/>
+                <w:color w:val="FF0000"/>
+                <w:szCs w:val="21"/>
+              </w:rPr>
+            </w:pPr>
+            <w:r>
+              <w:rPr>
+                <w:rFonts w:hint="eastAsia" w:eastAsia="黑体"/>
+                <w:color w:val="FF0000"/>
+                <w:szCs w:val="21"/>
+              </w:rPr>
+              <w:t xml:space="preserve"/>
+            </w:r>
+          </w:p>
+          <w:p>
+            <w:pPr>
+              <w:rPr>
+                <w:rFonts w:eastAsia="黑体"/>
+                <w:color w:val="FF0000"/>
+                <w:szCs w:val="21"/>
+              </w:rPr>
+            </w:pPr>
+            <w:r>
+              <w:rPr>
+                <w:rFonts w:hint="eastAsia" w:eastAsia="黑体"/>
+                <w:color w:val="FF0000"/>
+                <w:szCs w:val="21"/>
+              </w:rPr>
+              <w:t xml:space="preserve">步骤S6 采纳判定与回写：任务执行时，比对判定记录中的推荐内容与任务节点上最终提交的内容，按以下规则归类——推荐上门时间与关键帧图片均一致记为采纳；仅图片一致记为图片采纳；仅时间一致记为时间采纳；均不一致记为未采纳。比对时，时间以日期为粒度比对，图片以集合语义比对（不要求顺序一致）；路径与形式差异（同一图片的不同地址形式）视为同一内容。归类结果写入任务节点的采纳字段持久化。</w:t>
+            </w:r>
+          </w:p>
+          <w:p>
+            <w:pPr>
+              <w:rPr>
+                <w:rFonts w:eastAsia="黑体"/>
+                <w:color w:val="FF0000"/>
+                <w:szCs w:val="21"/>
+              </w:rPr>
+            </w:pPr>
+            <w:r>
+              <w:rPr>
+                <w:rFonts w:hint="eastAsia" w:eastAsia="黑体"/>
+                <w:color w:val="FF0000"/>
+                <w:szCs w:val="21"/>
+              </w:rPr>
+              <w:t xml:space="preserve"/>
+            </w:r>
+          </w:p>
+          <w:p>
+            <w:pPr>
+              <w:rPr>
+                <w:rFonts w:eastAsia="黑体"/>
+                <w:color w:val="FF0000"/>
+                <w:szCs w:val="21"/>
+              </w:rPr>
+            </w:pPr>
+            <w:r>
+              <w:rPr>
+                <w:rFonts w:hint="eastAsia" w:eastAsia="黑体"/>
+                <w:color w:val="FF0000"/>
+                <w:szCs w:val="21"/>
+              </w:rPr>
+              <w:t xml:space="preserve">步骤S7 轮询暂存与时间窗触达：按固定周期（本实施例为每日一次）轮询最新判定结果写入缓存并预取关键帧图片，缓存以任务标识为键保存最新判定结果与关键帧地址列表及写入时间，各页面读取缓存；摘要计数接口仅在预设时间窗内返回计数，窗口外返回零值；轮询中发现现场已完成任务时，向对应作业人员推送关闭提醒。</w:t>
+            </w:r>
+          </w:p>
+          <w:p>
+            <w:pPr>
+              <w:rPr>
+                <w:rFonts w:eastAsia="黑体"/>
+                <w:color w:val="FF0000"/>
+                <w:szCs w:val="21"/>
+              </w:rPr>
+            </w:pPr>
+            <w:r>
+              <w:rPr>
+                <w:rFonts w:hint="eastAsia" w:eastAsia="黑体"/>
+                <w:color w:val="FF0000"/>
+                <w:szCs w:val="21"/>
+              </w:rPr>
+              <w:t xml:space="preserve"/>
+            </w:r>
+          </w:p>
+          <w:p>
+            <w:pPr>
+              <w:rPr>
+                <w:rFonts w:eastAsia="黑体"/>
+                <w:color w:val="FF0000"/>
+                <w:szCs w:val="21"/>
+              </w:rPr>
+            </w:pPr>
+            <w:r>
+              <w:rPr>
+                <w:rFonts w:hint="eastAsia" w:eastAsia="黑体"/>
+                <w:color w:val="FF0000"/>
+                <w:szCs w:val="21"/>
+              </w:rPr>
+              <w:t xml:space="preserve">四、关键实现细节（补充公开充分性）：</w:t>
+            </w:r>
+          </w:p>
+          <w:p>
+            <w:pPr>
+              <w:rPr>
+                <w:rFonts w:eastAsia="黑体"/>
+                <w:color w:val="FF0000"/>
+                <w:szCs w:val="21"/>
+              </w:rPr>
+            </w:pPr>
+            <w:r>
+              <w:rPr>
+                <w:rFonts w:hint="eastAsia" w:eastAsia="黑体"/>
+                <w:color w:val="FF0000"/>
+                <w:szCs w:val="21"/>
+              </w:rPr>
+              <w:t xml:space="preserve"/>
+            </w:r>
+          </w:p>
+          <w:p>
+            <w:pPr>
+              <w:rPr>
+                <w:rFonts w:eastAsia="黑体"/>
+                <w:color w:val="FF0000"/>
+                <w:szCs w:val="21"/>
+              </w:rPr>
+            </w:pPr>
+            <w:r>
+              <w:rPr>
+                <w:rFonts w:hint="eastAsia" w:eastAsia="黑体"/>
+                <w:color w:val="FF0000"/>
+                <w:szCs w:val="21"/>
+              </w:rPr>
+              <w:t xml:space="preserve">1. 判定结果的产生：由上游识别服务对工地影像数据按若干识别项输出结论（识别项例如：前置工序完成标志、交界面可见性与遮挡情况、现场材料到位情况等），并按预设阈值汇总为判定状态。本发明不限定额外的识别算法本身，凡能输出上述判定状态者均可作为本方案的输入。</w:t>
+            </w:r>
+          </w:p>
+          <w:p>
+            <w:pPr>
+              <w:rPr>
+                <w:rFonts w:eastAsia="黑体"/>
+                <w:color w:val="FF0000"/>
+                <w:szCs w:val="21"/>
+              </w:rPr>
+            </w:pPr>
+            <w:r>
+              <w:rPr>
+                <w:rFonts w:hint="eastAsia" w:eastAsia="黑体"/>
+                <w:color w:val="FF0000"/>
+                <w:szCs w:val="21"/>
+              </w:rPr>
+              <w:t xml:space="preserve"/>
+            </w:r>
+          </w:p>
+          <w:p>
+            <w:pPr>
+              <w:rPr>
+                <w:rFonts w:eastAsia="黑体"/>
+                <w:color w:val="FF0000"/>
+                <w:szCs w:val="21"/>
+              </w:rPr>
+            </w:pPr>
+            <w:r>
+              <w:rPr>
+                <w:rFonts w:hint="eastAsia" w:eastAsia="黑体"/>
+                <w:color w:val="FF0000"/>
+                <w:szCs w:val="21"/>
+              </w:rPr>
+              <w:t xml:space="preserve">2. 并发执行实现：批量执行按批次提交至执行线程池，单任务设置超时时间；单项异常被捕获并计入失败明细，不影响同一批次中其他任务的执行结果；条件更新与下游调用之间不建立长事务，以执行状态字段的取值作为并发结果的事实依据。</w:t>
+            </w:r>
+          </w:p>
+          <w:p>
+            <w:pPr>
+              <w:rPr>
+                <w:rFonts w:eastAsia="黑体"/>
+                <w:color w:val="FF0000"/>
+                <w:szCs w:val="21"/>
+              </w:rPr>
+            </w:pPr>
+            <w:r>
+              <w:rPr>
+                <w:rFonts w:hint="eastAsia" w:eastAsia="黑体"/>
+                <w:color w:val="FF0000"/>
+                <w:szCs w:val="21"/>
+              </w:rPr>
+              <w:t xml:space="preserve"/>
+            </w:r>
+          </w:p>
+          <w:p>
+            <w:pPr>
+              <w:rPr>
+                <w:rFonts w:eastAsia="黑体"/>
+                <w:color w:val="FF0000"/>
+                <w:szCs w:val="21"/>
+              </w:rPr>
+            </w:pPr>
+            <w:r>
+              <w:rPr>
+                <w:rFonts w:hint="eastAsia" w:eastAsia="黑体"/>
+                <w:color w:val="FF0000"/>
+                <w:szCs w:val="21"/>
+              </w:rPr>
+              <w:t xml:space="preserve">3. 缓存与调用降频：页面访问不触发对上游识别服务的实时查询，仅读取轮询写入的缓存，从而将上游调用次数与页面访问量解耦。</w:t>
+            </w:r>
+          </w:p>
+          <w:p>
+            <w:pPr>
+              <w:rPr>
+                <w:rFonts w:eastAsia="黑体"/>
+                <w:color w:val="FF0000"/>
+                <w:szCs w:val="21"/>
+              </w:rPr>
+            </w:pPr>
+            <w:r>
+              <w:rPr>
+                <w:rFonts w:hint="eastAsia" w:eastAsia="黑体"/>
+                <w:color w:val="FF0000"/>
+                <w:szCs w:val="21"/>
+              </w:rPr>
+              <w:t xml:space="preserve"/>
+            </w:r>
+          </w:p>
+          <w:p>
+            <w:pPr>
+              <w:rPr>
+                <w:rFonts w:eastAsia="黑体"/>
+                <w:color w:val="FF0000"/>
+                <w:szCs w:val="21"/>
+              </w:rPr>
+            </w:pPr>
+            <w:r>
+              <w:rPr>
+                <w:rFonts w:hint="eastAsia" w:eastAsia="黑体"/>
+                <w:color w:val="FF0000"/>
+                <w:szCs w:val="21"/>
+              </w:rPr>
+              <w:t xml:space="preserve">五、技术效果（量化指标，提交前由发明人补齐实测数据）：① 重复执行拦截：两个执行通道并行/交叉触发时，同一任务节点仅被执行一次，重复通知为0笔；② 无效调用下降：条件更新失败者直接计入已处理，不再调用下游链路；③ 上游调用降频：由"随页面访问次数"降为"每任务每日一次"；④ 批量可靠性：单任务异常不影响同批其余任务，失败项可通过返回明细对账；⑤ 可控放行：开关未命中或配置缺失时功能不生效，误判影响限于已放行范围。</w:t>
+            </w:r>
+          </w:p>
+          <w:p>
+            <w:pPr>
+              <w:rPr>
+                <w:rFonts w:eastAsia="黑体"/>
+                <w:color w:val="FF0000"/>
+                <w:szCs w:val="21"/>
+              </w:rPr>
+            </w:pPr>
+            <w:r>
+              <w:rPr>
+                <w:rFonts w:hint="eastAsia" w:eastAsia="黑体"/>
+                <w:color w:val="FF0000"/>
+                <w:szCs w:val="21"/>
+              </w:rPr>
+              <w:t xml:space="preserve"/>
+            </w:r>
+          </w:p>
+          <w:p>
+            <w:pPr>
+              <w:rPr>
+                <w:rFonts w:eastAsia="黑体"/>
+                <w:color w:val="FF0000"/>
+                <w:szCs w:val="21"/>
+              </w:rPr>
+            </w:pPr>
+            <w:r>
+              <w:rPr>
+                <w:rFonts w:hint="eastAsia" w:eastAsia="黑体"/>
+                <w:color w:val="FF0000"/>
+                <w:szCs w:val="21"/>
+              </w:rPr>
+              <w:t xml:space="preserve">六、附图说明：图1系统总体架构图；图2判定结果分态与分类处置流程图；图3双通道互斥执行与采纳回写时序图；图4判定态—执行态—采纳态闭环关系图。上述四图见本交底书文末附图1至附图4。</w:t>
             </w:r>
           </w:p>
         </w:tc>
@@ -2697,82 +3629,615 @@
                 <w:color w:val="000000" w:themeColor="text1"/>
                 <w:szCs w:val="21"/>
               </w:rPr>
-              <w:t>请将填写好的技术交底书提交至大为专利管理系统，网址http://10.26.24.36-80.zt.ke.com。 若发明已被披露或于未来30天内将被披露给销售商、供应商或消费者，请尽快通知IP部加急处理。未来是否有披露计划？如有，请指明计划披露日期和对象，包括将向其披露该发明的制造商、销售商、承包商、放款人等，无论是否已签订NDA。如发现近似专利、论文文献请提供。如有能够帮助部相关人员理解本发明的其他技术参考文献请提供。</w:t>
-            </w:r>
-          </w:p>
-          <w:p>
-            <w:pPr>
-              <w:rPr>
-                <w:rFonts w:hint="eastAsia" w:ascii="仿宋" w:hAnsi="仿宋" w:eastAsia="仿宋"/>
-                <w:b w:val="1"/>
-                <w:color w:val="000000" w:themeColor="text1"/>
-                <w:szCs w:val="21"/>
-              </w:rPr>
-            </w:pPr>
-            <w:r>
-              <w:rPr>
-                <w:rFonts w:hint="eastAsia" w:ascii="仿宋" w:hAnsi="仿宋" w:eastAsia="仿宋"/>
-                <w:b w:val="1"/>
-                <w:color w:val="000000" w:themeColor="text1"/>
-                <w:szCs w:val="21"/>
-              </w:rPr>
-              <w:t>【填写内容】</w:t>
-            </w:r>
-          </w:p>
-          <w:p>
-            <w:pPr>
-              <w:rPr>
-                <w:rFonts w:hint="eastAsia" w:ascii="仿宋" w:hAnsi="仿宋" w:eastAsia="仿宋"/>
-                <w:b w:val="1"/>
-                <w:color w:val="000000" w:themeColor="text1"/>
-                <w:szCs w:val="21"/>
-              </w:rPr>
-            </w:pPr>
-            <w:r>
-              <w:rPr>
-                <w:rFonts w:hint="eastAsia" w:ascii="仿宋" w:hAnsi="仿宋" w:eastAsia="仿宋"/>
-                <w:b w:val="1"/>
-                <w:color w:val="000000" w:themeColor="text1"/>
-                <w:szCs w:val="21"/>
-              </w:rPr>
-              <w:t>1. 未来披露计划：暂无对外披露计划；如后续拟向供应商、合作方披露相关技术，将提前通知 IP 部加急处理。</w:t>
-            </w:r>
-          </w:p>
-          <w:p>
-            <w:pPr>
-              <w:rPr>
-                <w:rFonts w:hint="eastAsia" w:ascii="仿宋" w:hAnsi="仿宋" w:eastAsia="仿宋"/>
-                <w:b w:val="1"/>
-                <w:color w:val="000000" w:themeColor="text1"/>
-                <w:szCs w:val="21"/>
-              </w:rPr>
-            </w:pPr>
-            <w:r>
-              <w:rPr>
-                <w:rFonts w:hint="eastAsia" w:ascii="仿宋" w:hAnsi="仿宋" w:eastAsia="仿宋"/>
-                <w:b w:val="1"/>
-                <w:color w:val="000000" w:themeColor="text1"/>
-                <w:szCs w:val="21"/>
-              </w:rPr>
-              <w:t>2. 近似专利、论文文献：暂未检索到直接相同的"图像识别结果驱动任务履约状态机联动 + 分态处置 + CAS 幂等 + 采纳反馈回写"组合方案；建议以「图像识别 + 任务通知/履约自动化 + 人机协同」关键词进一步检索。</w:t>
-            </w:r>
-          </w:p>
-          <w:p>
-            <w:pPr>
-              <w:spacing w:line="0" w:lineRule="atLeast"/>
-              <w:rPr>
-                <w:rFonts w:ascii="Arial" w:hAnsi="Arial" w:cs="Arial"/>
-                <w:sz w:val="20"/>
-              </w:rPr>
-            </w:pPr>
-            <w:r>
-              <w:rPr>
-                <w:rFonts w:hint="eastAsia" w:ascii="仿宋" w:hAnsi="仿宋" w:eastAsia="仿宋"/>
-                <w:b w:val="1"/>
-                <w:color w:val="000000" w:themeColor="text1"/>
-                <w:szCs w:val="21"/>
-              </w:rPr>
-              <w:t>3. 其他技术参考文献：无。</w:t>
+              <w:t xml:space="preserve">请将填写好的技术交底书提交至大为专利管理系统，网址http://10.26.24.36-80.zt.ke.com。 若发明已被披露或于未来30天内将被披露给销售商、供应商或消费者，请尽快通知IP部加急处理。未来是否有披露计划？如有，请指明计划披露日期和对象，包括将向其披露该发明的制造商、销售商、承包商、放款人等，无论是否已签订NDA。如发现近似专利、论文文献请提供。如有能够帮助部相关人员理解本发明的其他技术参考文献请提供。</w:t>
+            </w:r>
+          </w:p>
+          <w:p>
+            <w:pPr>
+              <w:rPr>
+                <w:rFonts w:hint="eastAsia" w:ascii="仿宋" w:hAnsi="仿宋" w:eastAsia="仿宋"/>
+                <w:b w:val="1"/>
+                <w:color w:val="000000" w:themeColor="text1"/>
+                <w:szCs w:val="21"/>
+              </w:rPr>
+            </w:pPr>
+            <w:r>
+              <w:rPr>
+                <w:rFonts w:hint="eastAsia" w:ascii="仿宋" w:hAnsi="仿宋" w:eastAsia="仿宋"/>
+                <w:b w:val="1"/>
+                <w:color w:val="000000" w:themeColor="text1"/>
+                <w:szCs w:val="21"/>
+              </w:rPr>
+              <w:t xml:space="preserve"/>
+            </w:r>
+          </w:p>
+          <w:p>
+            <w:pPr>
+              <w:rPr>
+                <w:rFonts w:hint="eastAsia" w:ascii="仿宋" w:hAnsi="仿宋" w:eastAsia="仿宋"/>
+                <w:b w:val="1"/>
+                <w:color w:val="000000" w:themeColor="text1"/>
+                <w:szCs w:val="21"/>
+              </w:rPr>
+            </w:pPr>
+            <w:r>
+              <w:rPr>
+                <w:rFonts w:hint="eastAsia" w:ascii="仿宋" w:hAnsi="仿宋" w:eastAsia="仿宋"/>
+                <w:b w:val="1"/>
+                <w:color w:val="000000" w:themeColor="text1"/>
+                <w:szCs w:val="21"/>
+              </w:rPr>
+              <w:t xml:space="preserve">【填写内容】</w:t>
+            </w:r>
+          </w:p>
+          <w:p>
+            <w:pPr>
+              <w:rPr>
+                <w:rFonts w:hint="eastAsia" w:ascii="仿宋" w:hAnsi="仿宋" w:eastAsia="仿宋"/>
+                <w:b w:val="1"/>
+                <w:color w:val="000000" w:themeColor="text1"/>
+                <w:szCs w:val="21"/>
+              </w:rPr>
+            </w:pPr>
+            <w:r>
+              <w:rPr>
+                <w:rFonts w:hint="eastAsia" w:ascii="仿宋" w:hAnsi="仿宋" w:eastAsia="仿宋"/>
+                <w:b w:val="1"/>
+                <w:color w:val="000000" w:themeColor="text1"/>
+                <w:szCs w:val="21"/>
+              </w:rPr>
+              <w:t xml:space="preserve"/>
+            </w:r>
+          </w:p>
+          <w:p>
+            <w:pPr>
+              <w:rPr>
+                <w:rFonts w:hint="eastAsia" w:ascii="仿宋" w:hAnsi="仿宋" w:eastAsia="仿宋"/>
+                <w:b w:val="1"/>
+                <w:color w:val="000000" w:themeColor="text1"/>
+                <w:szCs w:val="21"/>
+              </w:rPr>
+            </w:pPr>
+            <w:r>
+              <w:rPr>
+                <w:rFonts w:hint="eastAsia" w:ascii="仿宋" w:hAnsi="仿宋" w:eastAsia="仿宋"/>
+                <w:b w:val="1"/>
+                <w:color w:val="000000" w:themeColor="text1"/>
+                <w:szCs w:val="21"/>
+              </w:rPr>
+              <w:t xml:space="preserve">一、未来披露计划：暂无对外披露计划；如后续拟向供应商、合作方披露相关技术，将提前通知IP部加急处理。</w:t>
+            </w:r>
+          </w:p>
+          <w:p>
+            <w:pPr>
+              <w:rPr>
+                <w:rFonts w:hint="eastAsia" w:ascii="仿宋" w:hAnsi="仿宋" w:eastAsia="仿宋"/>
+                <w:b w:val="1"/>
+                <w:color w:val="000000" w:themeColor="text1"/>
+                <w:szCs w:val="21"/>
+              </w:rPr>
+            </w:pPr>
+            <w:r>
+              <w:rPr>
+                <w:rFonts w:hint="eastAsia" w:ascii="仿宋" w:hAnsi="仿宋" w:eastAsia="仿宋"/>
+                <w:b w:val="1"/>
+                <w:color w:val="000000" w:themeColor="text1"/>
+                <w:szCs w:val="21"/>
+              </w:rPr>
+              <w:t xml:space="preserve"/>
+            </w:r>
+          </w:p>
+          <w:p>
+            <w:pPr>
+              <w:rPr>
+                <w:rFonts w:hint="eastAsia" w:ascii="仿宋" w:hAnsi="仿宋" w:eastAsia="仿宋"/>
+                <w:b w:val="1"/>
+                <w:color w:val="000000" w:themeColor="text1"/>
+                <w:szCs w:val="21"/>
+              </w:rPr>
+            </w:pPr>
+            <w:r>
+              <w:rPr>
+                <w:rFonts w:hint="eastAsia" w:ascii="仿宋" w:hAnsi="仿宋" w:eastAsia="仿宋"/>
+                <w:b w:val="1"/>
+                <w:color w:val="000000" w:themeColor="text1"/>
+                <w:szCs w:val="21"/>
+              </w:rPr>
+              <w:t xml:space="preserve">二、自公开风险评估（重要，提交前须确认）：本方案对应系统已于2026年8月完成开发并上线运行。需向IP部核实并说明：（1）上线范围为内部灰度或全量、功能入口对未命中开关的人员是否可见；（2）可使用该功能的主体（作业人员、供应商、服务人员）是否负有保密义务、是否签署保密约定；（3）是否存在对外宣传材料公开了实现方式（仅功能存在通常不足以公开实现方案）；（4）保留权限配置、访问日志与保密约定作为"未处于公众可得知状态"的证据。如经评估存在公开使用风险，建议将申请标的收敛至申请日前未对外暴露的增强特征（定时自动执行通道的条件更新门禁、采纳情况回写与准入调整）并另案申报。</w:t>
+            </w:r>
+          </w:p>
+          <w:p>
+            <w:pPr>
+              <w:rPr>
+                <w:rFonts w:hint="eastAsia" w:ascii="仿宋" w:hAnsi="仿宋" w:eastAsia="仿宋"/>
+                <w:b w:val="1"/>
+                <w:color w:val="000000" w:themeColor="text1"/>
+                <w:szCs w:val="21"/>
+              </w:rPr>
+            </w:pPr>
+            <w:r>
+              <w:rPr>
+                <w:rFonts w:hint="eastAsia" w:ascii="仿宋" w:hAnsi="仿宋" w:eastAsia="仿宋"/>
+                <w:b w:val="1"/>
+                <w:color w:val="000000" w:themeColor="text1"/>
+                <w:szCs w:val="21"/>
+              </w:rPr>
+              <w:t xml:space="preserve"/>
+            </w:r>
+          </w:p>
+          <w:p>
+            <w:pPr>
+              <w:rPr>
+                <w:rFonts w:hint="eastAsia" w:ascii="仿宋" w:hAnsi="仿宋" w:eastAsia="仿宋"/>
+                <w:b w:val="1"/>
+                <w:color w:val="000000" w:themeColor="text1"/>
+                <w:szCs w:val="21"/>
+              </w:rPr>
+            </w:pPr>
+            <w:r>
+              <w:rPr>
+                <w:rFonts w:hint="eastAsia" w:ascii="仿宋" w:hAnsi="仿宋" w:eastAsia="仿宋"/>
+                <w:b w:val="1"/>
+                <w:color w:val="000000" w:themeColor="text1"/>
+                <w:szCs w:val="21"/>
+              </w:rPr>
+              <w:t xml:space="preserve">三、近似专利、论文文献：暂未检索到与本方案核心组合（识别结论驱动任务节点执行资格判定 + 以执行状态字段为唯一竞争资源的多通道条件更新互斥 + 采纳情况回写调整放行范围）相同的公开文献；建议以「图像识别 + 任务调度/履约自动化 + 并发控制/幂等」为关键词在CNIPA、Google Patents进一步检索。</w:t>
+            </w:r>
+          </w:p>
+          <w:p>
+            <w:pPr>
+              <w:rPr>
+                <w:rFonts w:hint="eastAsia" w:ascii="仿宋" w:hAnsi="仿宋" w:eastAsia="仿宋"/>
+                <w:b w:val="1"/>
+                <w:color w:val="000000" w:themeColor="text1"/>
+                <w:szCs w:val="21"/>
+              </w:rPr>
+            </w:pPr>
+            <w:r>
+              <w:rPr>
+                <w:rFonts w:hint="eastAsia" w:ascii="仿宋" w:hAnsi="仿宋" w:eastAsia="仿宋"/>
+                <w:b w:val="1"/>
+                <w:color w:val="000000" w:themeColor="text1"/>
+                <w:szCs w:val="21"/>
+              </w:rPr>
+              <w:t xml:space="preserve"/>
+            </w:r>
+          </w:p>
+          <w:p>
+            <w:pPr>
+              <w:rPr>
+                <w:rFonts w:hint="eastAsia" w:ascii="仿宋" w:hAnsi="仿宋" w:eastAsia="仿宋"/>
+                <w:b w:val="1"/>
+                <w:color w:val="000000" w:themeColor="text1"/>
+                <w:szCs w:val="21"/>
+              </w:rPr>
+            </w:pPr>
+            <w:r>
+              <w:rPr>
+                <w:rFonts w:hint="eastAsia" w:ascii="仿宋" w:hAnsi="仿宋" w:eastAsia="仿宋"/>
+                <w:b w:val="1"/>
+                <w:color w:val="000000" w:themeColor="text1"/>
+                <w:szCs w:val="21"/>
+              </w:rPr>
+              <w:t xml:space="preserve">四、其他技术参考文献：无。</w:t>
+            </w:r>
+          </w:p>
+          <w:p>
+            <w:pPr>
+              <w:rPr>
+                <w:rFonts w:hint="eastAsia" w:ascii="仿宋" w:hAnsi="仿宋" w:eastAsia="仿宋"/>
+                <w:b w:val="1"/>
+                <w:color w:val="000000" w:themeColor="text1"/>
+                <w:szCs w:val="21"/>
+              </w:rPr>
+            </w:pPr>
+            <w:r>
+              <w:rPr>
+                <w:rFonts w:hint="eastAsia" w:ascii="仿宋" w:hAnsi="仿宋" w:eastAsia="仿宋"/>
+                <w:b w:val="1"/>
+                <w:color w:val="000000" w:themeColor="text1"/>
+                <w:szCs w:val="21"/>
+              </w:rPr>
+              <w:t xml:space="preserve"/>
+            </w:r>
+          </w:p>
+          <w:p>
+            <w:pPr>
+              <w:rPr>
+                <w:rFonts w:hint="eastAsia" w:ascii="仿宋" w:hAnsi="仿宋" w:eastAsia="仿宋"/>
+                <w:b w:val="1"/>
+                <w:color w:val="000000" w:themeColor="text1"/>
+                <w:szCs w:val="21"/>
+              </w:rPr>
+            </w:pPr>
+            <w:r>
+              <w:rPr>
+                <w:rFonts w:hint="eastAsia" w:ascii="仿宋" w:hAnsi="仿宋" w:eastAsia="仿宋"/>
+                <w:b w:val="1"/>
+                <w:color w:val="000000" w:themeColor="text1"/>
+                <w:szCs w:val="21"/>
+              </w:rPr>
+              <w:t xml:space="preserve">五、拆分申报建议（供代理人参考）：本方案的七个要点横跨"识别结果接入与分态处置""执行并发控制与采纳闭环"两个环节。若全部写入独立权利要求，保护范围过宽而易被质疑创造性；建议拆分为两件申请，共享同一说明书：主案A（要点1、3、4、7：识别结论到任务节点的数据通路、多态处置、跨源回填、轮询缓存）；副案B（要点2、5、6：以执行状态字段为唯一竞争资源的双通道互斥执行、分级放行、采纳回写与准入调整），副案B最可能避开"公知手段组合"的质疑。</w:t>
+            </w:r>
+          </w:p>
+          <w:p>
+            <w:pPr>
+              <w:rPr>
+                <w:rFonts w:hint="eastAsia" w:ascii="仿宋" w:hAnsi="仿宋" w:eastAsia="仿宋"/>
+                <w:b w:val="1"/>
+                <w:color w:val="000000" w:themeColor="text1"/>
+                <w:szCs w:val="21"/>
+              </w:rPr>
+            </w:pPr>
+            <w:r>
+              <w:rPr>
+                <w:rFonts w:hint="eastAsia" w:ascii="仿宋" w:hAnsi="仿宋" w:eastAsia="仿宋"/>
+                <w:b w:val="1"/>
+                <w:color w:val="000000" w:themeColor="text1"/>
+                <w:szCs w:val="21"/>
+              </w:rPr>
+              <w:t xml:space="preserve"/>
+            </w:r>
+          </w:p>
+          <w:p>
+            <w:pPr>
+              <w:rPr>
+                <w:rFonts w:hint="eastAsia" w:ascii="仿宋" w:hAnsi="仿宋" w:eastAsia="仿宋"/>
+                <w:b w:val="1"/>
+                <w:color w:val="000000" w:themeColor="text1"/>
+                <w:szCs w:val="21"/>
+              </w:rPr>
+            </w:pPr>
+            <w:r>
+              <w:rPr>
+                <w:rFonts w:hint="eastAsia" w:ascii="仿宋" w:hAnsi="仿宋" w:eastAsia="仿宋"/>
+                <w:b w:val="1"/>
+                <w:color w:val="000000" w:themeColor="text1"/>
+                <w:szCs w:val="21"/>
+              </w:rPr>
+              <w:t xml:space="preserve">六、权利要求建议稿（供代理人参考，非正式文本）：</w:t>
+            </w:r>
+          </w:p>
+          <w:p>
+            <w:pPr>
+              <w:rPr>
+                <w:rFonts w:hint="eastAsia" w:ascii="仿宋" w:hAnsi="仿宋" w:eastAsia="仿宋"/>
+                <w:b w:val="1"/>
+                <w:color w:val="000000" w:themeColor="text1"/>
+                <w:szCs w:val="21"/>
+              </w:rPr>
+            </w:pPr>
+            <w:r>
+              <w:rPr>
+                <w:rFonts w:hint="eastAsia" w:ascii="仿宋" w:hAnsi="仿宋" w:eastAsia="仿宋"/>
+                <w:b w:val="1"/>
+                <w:color w:val="000000" w:themeColor="text1"/>
+                <w:szCs w:val="21"/>
+              </w:rPr>
+              <w:t xml:space="preserve"/>
+            </w:r>
+          </w:p>
+          <w:p>
+            <w:pPr>
+              <w:rPr>
+                <w:rFonts w:hint="eastAsia" w:ascii="仿宋" w:hAnsi="仿宋" w:eastAsia="仿宋"/>
+                <w:b w:val="1"/>
+                <w:color w:val="000000" w:themeColor="text1"/>
+                <w:szCs w:val="21"/>
+              </w:rPr>
+            </w:pPr>
+            <w:r>
+              <w:rPr>
+                <w:rFonts w:hint="eastAsia" w:ascii="仿宋" w:hAnsi="仿宋" w:eastAsia="仿宋"/>
+                <w:b w:val="1"/>
+                <w:color w:val="000000" w:themeColor="text1"/>
+                <w:szCs w:val="21"/>
+              </w:rPr>
+              <w:t xml:space="preserve">1. 一种基于图像识别结果的任务通知方法，其特征在于，包括：接收对工地影像数据分析所得的判定结果，所述判定结果至少包括指示满足执行条件的第一状态与指示不满足执行条件的第二状态；将所述判定结果与任务标识、任务类型及识别时间关联后持久化为判定记录；根据所述判定记录与任务节点实例之间的关联关系，确定任务节点的字段填充内容与执行资格；在任务节点实例的执行状态字段上，以未执行态至目标态的条件更新判定执行资格，条件更新成功时调用任务提交通路执行通知，条件更新失败时放弃执行。</w:t>
+            </w:r>
+          </w:p>
+          <w:p>
+            <w:pPr>
+              <w:rPr>
+                <w:rFonts w:hint="eastAsia" w:ascii="仿宋" w:hAnsi="仿宋" w:eastAsia="仿宋"/>
+                <w:b w:val="1"/>
+                <w:color w:val="000000" w:themeColor="text1"/>
+                <w:szCs w:val="21"/>
+              </w:rPr>
+            </w:pPr>
+            <w:r>
+              <w:rPr>
+                <w:rFonts w:hint="eastAsia" w:ascii="仿宋" w:hAnsi="仿宋" w:eastAsia="仿宋"/>
+                <w:b w:val="1"/>
+                <w:color w:val="000000" w:themeColor="text1"/>
+                <w:szCs w:val="21"/>
+              </w:rPr>
+              <w:t xml:space="preserve"/>
+            </w:r>
+          </w:p>
+          <w:p>
+            <w:pPr>
+              <w:rPr>
+                <w:rFonts w:hint="eastAsia" w:ascii="仿宋" w:hAnsi="仿宋" w:eastAsia="仿宋"/>
+                <w:b w:val="1"/>
+                <w:color w:val="000000" w:themeColor="text1"/>
+                <w:szCs w:val="21"/>
+              </w:rPr>
+            </w:pPr>
+            <w:r>
+              <w:rPr>
+                <w:rFonts w:hint="eastAsia" w:ascii="仿宋" w:hAnsi="仿宋" w:eastAsia="仿宋"/>
+                <w:b w:val="1"/>
+                <w:color w:val="000000" w:themeColor="text1"/>
+                <w:szCs w:val="21"/>
+              </w:rPr>
+              <w:t xml:space="preserve">2. 根据权利要求1所述的方法，其特征在于，所述判定结果还包括指示无法判断的第三状态与指示现场已完成的第四状态；第三状态与第二状态被归入预警集合且禁止进入自动执行，第四状态触发关闭提醒并禁止进入自动执行。</w:t>
+            </w:r>
+          </w:p>
+          <w:p>
+            <w:pPr>
+              <w:rPr>
+                <w:rFonts w:hint="eastAsia" w:ascii="仿宋" w:hAnsi="仿宋" w:eastAsia="仿宋"/>
+                <w:b w:val="1"/>
+                <w:color w:val="000000" w:themeColor="text1"/>
+                <w:szCs w:val="21"/>
+              </w:rPr>
+            </w:pPr>
+            <w:r>
+              <w:rPr>
+                <w:rFonts w:hint="eastAsia" w:ascii="仿宋" w:hAnsi="仿宋" w:eastAsia="仿宋"/>
+                <w:b w:val="1"/>
+                <w:color w:val="000000" w:themeColor="text1"/>
+                <w:szCs w:val="21"/>
+              </w:rPr>
+              <w:t xml:space="preserve"/>
+            </w:r>
+          </w:p>
+          <w:p>
+            <w:pPr>
+              <w:rPr>
+                <w:rFonts w:hint="eastAsia" w:ascii="仿宋" w:hAnsi="仿宋" w:eastAsia="仿宋"/>
+                <w:b w:val="1"/>
+                <w:color w:val="000000" w:themeColor="text1"/>
+                <w:szCs w:val="21"/>
+              </w:rPr>
+            </w:pPr>
+            <w:r>
+              <w:rPr>
+                <w:rFonts w:hint="eastAsia" w:ascii="仿宋" w:hAnsi="仿宋" w:eastAsia="仿宋"/>
+                <w:b w:val="1"/>
+                <w:color w:val="000000" w:themeColor="text1"/>
+                <w:szCs w:val="21"/>
+              </w:rPr>
+              <w:t xml:space="preserve">3. 根据权利要求1所述的方法，其特征在于，所述字段填充内容包括上门时间与现场图片；读取时优先采用任务节点实例中的字段值，该字段值缺失时回退读取判定记录中的有效值；用户修改后的字段值回写至任务节点实例。</w:t>
+            </w:r>
+          </w:p>
+          <w:p>
+            <w:pPr>
+              <w:rPr>
+                <w:rFonts w:hint="eastAsia" w:ascii="仿宋" w:hAnsi="仿宋" w:eastAsia="仿宋"/>
+                <w:b w:val="1"/>
+                <w:color w:val="000000" w:themeColor="text1"/>
+                <w:szCs w:val="21"/>
+              </w:rPr>
+            </w:pPr>
+            <w:r>
+              <w:rPr>
+                <w:rFonts w:hint="eastAsia" w:ascii="仿宋" w:hAnsi="仿宋" w:eastAsia="仿宋"/>
+                <w:b w:val="1"/>
+                <w:color w:val="000000" w:themeColor="text1"/>
+                <w:szCs w:val="21"/>
+              </w:rPr>
+              <w:t xml:space="preserve"/>
+            </w:r>
+          </w:p>
+          <w:p>
+            <w:pPr>
+              <w:rPr>
+                <w:rFonts w:hint="eastAsia" w:ascii="仿宋" w:hAnsi="仿宋" w:eastAsia="仿宋"/>
+                <w:b w:val="1"/>
+                <w:color w:val="000000" w:themeColor="text1"/>
+                <w:szCs w:val="21"/>
+              </w:rPr>
+            </w:pPr>
+            <w:r>
+              <w:rPr>
+                <w:rFonts w:hint="eastAsia" w:ascii="仿宋" w:hAnsi="仿宋" w:eastAsia="仿宋"/>
+                <w:b w:val="1"/>
+                <w:color w:val="000000" w:themeColor="text1"/>
+                <w:szCs w:val="21"/>
+              </w:rPr>
+              <w:t xml:space="preserve">4. 根据权利要求1所述的方法，其特征在于，所述条件更新由人工批量执行通道与定时自动执行通道共用，两通道以所述执行状态字段作为唯一竞争资源。</w:t>
+            </w:r>
+          </w:p>
+          <w:p>
+            <w:pPr>
+              <w:rPr>
+                <w:rFonts w:hint="eastAsia" w:ascii="仿宋" w:hAnsi="仿宋" w:eastAsia="仿宋"/>
+                <w:b w:val="1"/>
+                <w:color w:val="000000" w:themeColor="text1"/>
+                <w:szCs w:val="21"/>
+              </w:rPr>
+            </w:pPr>
+            <w:r>
+              <w:rPr>
+                <w:rFonts w:hint="eastAsia" w:ascii="仿宋" w:hAnsi="仿宋" w:eastAsia="仿宋"/>
+                <w:b w:val="1"/>
+                <w:color w:val="000000" w:themeColor="text1"/>
+                <w:szCs w:val="21"/>
+              </w:rPr>
+              <w:t xml:space="preserve"/>
+            </w:r>
+          </w:p>
+          <w:p>
+            <w:pPr>
+              <w:rPr>
+                <w:rFonts w:hint="eastAsia" w:ascii="仿宋" w:hAnsi="仿宋" w:eastAsia="仿宋"/>
+                <w:b w:val="1"/>
+                <w:color w:val="000000" w:themeColor="text1"/>
+                <w:szCs w:val="21"/>
+              </w:rPr>
+            </w:pPr>
+            <w:r>
+              <w:rPr>
+                <w:rFonts w:hint="eastAsia" w:ascii="仿宋" w:hAnsi="仿宋" w:eastAsia="仿宋"/>
+                <w:b w:val="1"/>
+                <w:color w:val="000000" w:themeColor="text1"/>
+                <w:szCs w:val="21"/>
+              </w:rPr>
+              <w:t xml:space="preserve">5. 根据权利要求1所述的方法，其特征在于，还包括按组织维度集合或按品类集合控制执行资格的放行，开关配置缺失时判定为未命中。</w:t>
+            </w:r>
+          </w:p>
+          <w:p>
+            <w:pPr>
+              <w:rPr>
+                <w:rFonts w:hint="eastAsia" w:ascii="仿宋" w:hAnsi="仿宋" w:eastAsia="仿宋"/>
+                <w:b w:val="1"/>
+                <w:color w:val="000000" w:themeColor="text1"/>
+                <w:szCs w:val="21"/>
+              </w:rPr>
+            </w:pPr>
+            <w:r>
+              <w:rPr>
+                <w:rFonts w:hint="eastAsia" w:ascii="仿宋" w:hAnsi="仿宋" w:eastAsia="仿宋"/>
+                <w:b w:val="1"/>
+                <w:color w:val="000000" w:themeColor="text1"/>
+                <w:szCs w:val="21"/>
+              </w:rPr>
+              <w:t xml:space="preserve"/>
+            </w:r>
+          </w:p>
+          <w:p>
+            <w:pPr>
+              <w:rPr>
+                <w:rFonts w:hint="eastAsia" w:ascii="仿宋" w:hAnsi="仿宋" w:eastAsia="仿宋"/>
+                <w:b w:val="1"/>
+                <w:color w:val="000000" w:themeColor="text1"/>
+                <w:szCs w:val="21"/>
+              </w:rPr>
+            </w:pPr>
+            <w:r>
+              <w:rPr>
+                <w:rFonts w:hint="eastAsia" w:ascii="仿宋" w:hAnsi="仿宋" w:eastAsia="仿宋"/>
+                <w:b w:val="1"/>
+                <w:color w:val="000000" w:themeColor="text1"/>
+                <w:szCs w:val="21"/>
+              </w:rPr>
+              <w:t xml:space="preserve">6. 根据权利要求1所述的方法，其特征在于，还包括：将所述判定记录中的推荐内容与任务节点上最终提交的内容进行比对，按内容一致、仅图片一致、仅时间一致或均不一致分别记为采纳、图片采纳、时间采纳或未采纳，并将归类结果写入任务节点的采纳字段，以及根据归类结果调整后续的自动执行准入范围。</w:t>
+            </w:r>
+          </w:p>
+          <w:p>
+            <w:pPr>
+              <w:rPr>
+                <w:rFonts w:hint="eastAsia" w:ascii="仿宋" w:hAnsi="仿宋" w:eastAsia="仿宋"/>
+                <w:b w:val="1"/>
+                <w:color w:val="000000" w:themeColor="text1"/>
+                <w:szCs w:val="21"/>
+              </w:rPr>
+            </w:pPr>
+            <w:r>
+              <w:rPr>
+                <w:rFonts w:hint="eastAsia" w:ascii="仿宋" w:hAnsi="仿宋" w:eastAsia="仿宋"/>
+                <w:b w:val="1"/>
+                <w:color w:val="000000" w:themeColor="text1"/>
+                <w:szCs w:val="21"/>
+              </w:rPr>
+              <w:t xml:space="preserve"/>
+            </w:r>
+          </w:p>
+          <w:p>
+            <w:pPr>
+              <w:rPr>
+                <w:rFonts w:hint="eastAsia" w:ascii="仿宋" w:hAnsi="仿宋" w:eastAsia="仿宋"/>
+                <w:b w:val="1"/>
+                <w:color w:val="000000" w:themeColor="text1"/>
+                <w:szCs w:val="21"/>
+              </w:rPr>
+            </w:pPr>
+            <w:r>
+              <w:rPr>
+                <w:rFonts w:hint="eastAsia" w:ascii="仿宋" w:hAnsi="仿宋" w:eastAsia="仿宋"/>
+                <w:b w:val="1"/>
+                <w:color w:val="000000" w:themeColor="text1"/>
+                <w:szCs w:val="21"/>
+              </w:rPr>
+              <w:t xml:space="preserve">7. 根据权利要求1至6任一项所述的方法，其特征在于，所述条件更新成功时，并行调用同一条任务提交通路，单项异常被执行隔离。</w:t>
+            </w:r>
+          </w:p>
+          <w:p>
+            <w:pPr>
+              <w:rPr>
+                <w:rFonts w:hint="eastAsia" w:ascii="仿宋" w:hAnsi="仿宋" w:eastAsia="仿宋"/>
+                <w:b w:val="1"/>
+                <w:color w:val="000000" w:themeColor="text1"/>
+                <w:szCs w:val="21"/>
+              </w:rPr>
+            </w:pPr>
+            <w:r>
+              <w:rPr>
+                <w:rFonts w:hint="eastAsia" w:ascii="仿宋" w:hAnsi="仿宋" w:eastAsia="仿宋"/>
+                <w:b w:val="1"/>
+                <w:color w:val="000000" w:themeColor="text1"/>
+                <w:szCs w:val="21"/>
+              </w:rPr>
+              <w:t xml:space="preserve"/>
+            </w:r>
+          </w:p>
+          <w:p>
+            <w:pPr>
+              <w:rPr>
+                <w:rFonts w:hint="eastAsia" w:ascii="仿宋" w:hAnsi="仿宋" w:eastAsia="仿宋"/>
+                <w:b w:val="1"/>
+                <w:color w:val="000000" w:themeColor="text1"/>
+                <w:szCs w:val="21"/>
+              </w:rPr>
+            </w:pPr>
+            <w:r>
+              <w:rPr>
+                <w:rFonts w:hint="eastAsia" w:ascii="仿宋" w:hAnsi="仿宋" w:eastAsia="仿宋"/>
+                <w:b w:val="1"/>
+                <w:color w:val="000000" w:themeColor="text1"/>
+                <w:szCs w:val="21"/>
+              </w:rPr>
+              <w:t xml:space="preserve">8. 一种任务通知系统，包括处理器与存储器，所述存储器存储有计算机程序，其特征在于，所述处理器执行所述计算机程序时实现权利要求1至7任一项所述的方法。</w:t>
+            </w:r>
+          </w:p>
+          <w:p>
+            <w:pPr>
+              <w:rPr>
+                <w:rFonts w:hint="eastAsia" w:ascii="仿宋" w:hAnsi="仿宋" w:eastAsia="仿宋"/>
+                <w:b w:val="1"/>
+                <w:color w:val="000000" w:themeColor="text1"/>
+                <w:szCs w:val="21"/>
+              </w:rPr>
+            </w:pPr>
+            <w:r>
+              <w:rPr>
+                <w:rFonts w:hint="eastAsia" w:ascii="仿宋" w:hAnsi="仿宋" w:eastAsia="仿宋"/>
+                <w:b w:val="1"/>
+                <w:color w:val="000000" w:themeColor="text1"/>
+                <w:szCs w:val="21"/>
+              </w:rPr>
+              <w:t xml:space="preserve"/>
+            </w:r>
+          </w:p>
+          <w:p>
+            <w:pPr>
+              <w:rPr>
+                <w:rFonts w:hint="eastAsia" w:ascii="仿宋" w:hAnsi="仿宋" w:eastAsia="仿宋"/>
+                <w:b w:val="1"/>
+                <w:color w:val="000000" w:themeColor="text1"/>
+                <w:szCs w:val="21"/>
+              </w:rPr>
+            </w:pPr>
+            <w:r>
+              <w:rPr>
+                <w:rFonts w:hint="eastAsia" w:ascii="仿宋" w:hAnsi="仿宋" w:eastAsia="仿宋"/>
+                <w:b w:val="1"/>
+                <w:color w:val="000000" w:themeColor="text1"/>
+                <w:szCs w:val="21"/>
+              </w:rPr>
+              <w:t xml:space="preserve">9. 一种计算机可读存储介质，其上存储有计算机程序，其特征在于，所述计算机程序被处理器执行时实现权利要求1至7任一项所述的方法。</w:t>
             </w:r>
           </w:p>
         </w:tc>
@@ -2785,6 +4250,206 @@
           <w:szCs w:val="10"/>
         </w:rPr>
       </w:pPr>
+    </w:p>
+    <w:p>
+      <w:pPr>
+        <w:jc w:val="center"/>
+      </w:pPr>
+      <w:r>
+        <w:drawing>
+          <wp:inline distT="0" distB="0" distL="0" distR="0">
+            <wp:extent cx="5486400" cy="2852928"/>
+            <wp:effectExtent l="0" t="0" r="0" b="0"/>
+            <wp:docPr id="101" name="fig1.png"/>
+            <wp:cNvGraphicFramePr>
+              <a:graphicFrameLocks noChangeAspect="1"/>
+            </wp:cNvGraphicFramePr>
+            <a:graphic>
+              <a:graphicData uri="http://schemas.openxmlformats.org/drawingml/2006/picture">
+                <pic:pic>
+                  <pic:nvPicPr>
+                    <pic:cNvPr id="101" name="fig1.png"/>
+                    <pic:cNvPicPr/>
+                  </pic:nvPicPr>
+                  <pic:blipFill>
+                    <a:blip r:embed="rIdFig1"/>
+                    <a:stretch>
+                      <a:fillRect/>
+                    </a:stretch>
+                  </pic:blipFill>
+                  <pic:spPr>
+                    <a:xfrm>
+                      <a:off x="0" y="0"/>
+                      <a:ext cx="5486400" cy="2852928"/>
+                    </a:xfrm>
+                    <a:prstGeom prst="rect">
+                      <a:avLst/>
+                    </a:prstGeom>
+                  </pic:spPr>
+                </pic:pic>
+              </a:graphicData>
+            </a:graphic>
+          </wp:inline>
+        </w:drawing>
+      </w:r>
+    </w:p>
+    <w:p>
+      <w:pPr>
+        <w:jc w:val="center"/>
+      </w:pPr>
+      <w:r>
+        <w:t>图1  系统总体架构图</w:t>
+      </w:r>
+    </w:p>
+    <w:p>
+      <w:pPr>
+        <w:jc w:val="center"/>
+      </w:pPr>
+      <w:r>
+        <w:drawing>
+          <wp:inline distT="0" distB="0" distL="0" distR="0">
+            <wp:extent cx="5486400" cy="2743200"/>
+            <wp:effectExtent l="0" t="0" r="0" b="0"/>
+            <wp:docPr id="102" name="fig2.png"/>
+            <wp:cNvGraphicFramePr>
+              <a:graphicFrameLocks noChangeAspect="1"/>
+            </wp:cNvGraphicFramePr>
+            <a:graphic>
+              <a:graphicData uri="http://schemas.openxmlformats.org/drawingml/2006/picture">
+                <pic:pic>
+                  <pic:nvPicPr>
+                    <pic:cNvPr id="102" name="fig2.png"/>
+                    <pic:cNvPicPr/>
+                  </pic:nvPicPr>
+                  <pic:blipFill>
+                    <a:blip r:embed="rIdFig2"/>
+                    <a:stretch>
+                      <a:fillRect/>
+                    </a:stretch>
+                  </pic:blipFill>
+                  <pic:spPr>
+                    <a:xfrm>
+                      <a:off x="0" y="0"/>
+                      <a:ext cx="5486400" cy="2743200"/>
+                    </a:xfrm>
+                    <a:prstGeom prst="rect">
+                      <a:avLst/>
+                    </a:prstGeom>
+                  </pic:spPr>
+                </pic:pic>
+              </a:graphicData>
+            </a:graphic>
+          </wp:inline>
+        </w:drawing>
+      </w:r>
+    </w:p>
+    <w:p>
+      <w:pPr>
+        <w:jc w:val="center"/>
+      </w:pPr>
+      <w:r>
+        <w:t>图2  判定结果分态与分类处置流程图</w:t>
+      </w:r>
+    </w:p>
+    <w:p>
+      <w:pPr>
+        <w:jc w:val="center"/>
+      </w:pPr>
+      <w:r>
+        <w:drawing>
+          <wp:inline distT="0" distB="0" distL="0" distR="0">
+            <wp:extent cx="5486400" cy="2304288"/>
+            <wp:effectExtent l="0" t="0" r="0" b="0"/>
+            <wp:docPr id="103" name="fig3.png"/>
+            <wp:cNvGraphicFramePr>
+              <a:graphicFrameLocks noChangeAspect="1"/>
+            </wp:cNvGraphicFramePr>
+            <a:graphic>
+              <a:graphicData uri="http://schemas.openxmlformats.org/drawingml/2006/picture">
+                <pic:pic>
+                  <pic:nvPicPr>
+                    <pic:cNvPr id="103" name="fig3.png"/>
+                    <pic:cNvPicPr/>
+                  </pic:nvPicPr>
+                  <pic:blipFill>
+                    <a:blip r:embed="rIdFig3"/>
+                    <a:stretch>
+                      <a:fillRect/>
+                    </a:stretch>
+                  </pic:blipFill>
+                  <pic:spPr>
+                    <a:xfrm>
+                      <a:off x="0" y="0"/>
+                      <a:ext cx="5486400" cy="2304288"/>
+                    </a:xfrm>
+                    <a:prstGeom prst="rect">
+                      <a:avLst/>
+                    </a:prstGeom>
+                  </pic:spPr>
+                </pic:pic>
+              </a:graphicData>
+            </a:graphic>
+          </wp:inline>
+        </w:drawing>
+      </w:r>
+    </w:p>
+    <w:p>
+      <w:pPr>
+        <w:jc w:val="center"/>
+      </w:pPr>
+      <w:r>
+        <w:t>图3  双通道互斥执行与采纳回写时序图</w:t>
+      </w:r>
+    </w:p>
+    <w:p>
+      <w:pPr>
+        <w:jc w:val="center"/>
+      </w:pPr>
+      <w:r>
+        <w:drawing>
+          <wp:inline distT="0" distB="0" distL="0" distR="0">
+            <wp:extent cx="5486400" cy="3072384"/>
+            <wp:effectExtent l="0" t="0" r="0" b="0"/>
+            <wp:docPr id="104" name="fig4.png"/>
+            <wp:cNvGraphicFramePr>
+              <a:graphicFrameLocks noChangeAspect="1"/>
+            </wp:cNvGraphicFramePr>
+            <a:graphic>
+              <a:graphicData uri="http://schemas.openxmlformats.org/drawingml/2006/picture">
+                <pic:pic>
+                  <pic:nvPicPr>
+                    <pic:cNvPr id="104" name="fig4.png"/>
+                    <pic:cNvPicPr/>
+                  </pic:nvPicPr>
+                  <pic:blipFill>
+                    <a:blip r:embed="rIdFig4"/>
+                    <a:stretch>
+                      <a:fillRect/>
+                    </a:stretch>
+                  </pic:blipFill>
+                  <pic:spPr>
+                    <a:xfrm>
+                      <a:off x="0" y="0"/>
+                      <a:ext cx="5486400" cy="3072384"/>
+                    </a:xfrm>
+                    <a:prstGeom prst="rect">
+                      <a:avLst/>
+                    </a:prstGeom>
+                  </pic:spPr>
+                </pic:pic>
+              </a:graphicData>
+            </a:graphic>
+          </wp:inline>
+        </w:drawing>
+      </w:r>
+    </w:p>
+    <w:p>
+      <w:pPr>
+        <w:jc w:val="center"/>
+      </w:pPr>
+      <w:r>
+        <w:t>图4  判定态—执行态—采纳态闭环关系图</w:t>
+      </w:r>
     </w:p>
     <w:sectPr>
       <w:headerReference r:id="rId8" w:type="default"/>

</xml_diff>